<commit_message>
fix(docs): eliminate Chinese placeholder in English links and align security advisories across whitepapers
</commit_message>
<xml_diff>
--- a/assets/whitepaper/TheFatCat_Whitepaper_v1.0_EN.docx
+++ b/assets/whitepaper/TheFatCat_Whitepaper_v1.0_EN.docx
@@ -3657,7 +3657,7 @@
         <w:pStyle w:val="Subtitle"/>
       </w:pPr>
       <w:r>
-        <w:t>4.3 `MIN_STAKE` Barrier and Seniority Certificate Roadmap</w:t>
+        <w:t>4.3 `MIN_STAKE` Barrier and Seniority Certificate Specification</w:t>
       </w:r>
     </w:p>
     <w:p>
@@ -3781,7 +3781,7 @@
           <w:szCs w:val="21"/>
           <w:color w:val="1F1F1F"/>
         </w:rPr>
-        <w:t xml:space="preserve">Seniority Physicalization Channel (`SeniorityCertificate` Roadmap)</w:t>
+        <w:t xml:space="preserve">Seniority Physicalization Channel ([`SeniorityCertificate.sol`](../contracts/src/SeniorityCertificate.sol))</w:t>
       </w:r>
       <w:r>
         <w:rPr>
@@ -3808,38 +3808,23 @@
           <w:szCs w:val="21"/>
           <w:color w:val="1F1F1F"/>
         </w:rPr>
-        <w:t xml:space="preserve">Voluntary Issuance on Exit</w:t>
-      </w:r>
-      <w:r>
-        <w:rPr>
-          <w:sz w:val="21"/>
-          <w:color w:val="1F1F1F"/>
-        </w:rPr>
-        <w:t xml:space="preserve">: Planned as a post-launch roadmap module; stakers exiting an active position may choose to imprint their accrued seniority notch (up to 22) into an immutable ERC-721 credential (</w:t>
-      </w:r>
-      <w:r>
-        <w:rPr>
-          <w:sz w:val="21"/>
+        <w:t xml:space="preserve">Genesis Deployment</w:t>
+      </w:r>
+      <w:r>
+        <w:rPr>
+          <w:sz w:val="21"/>
+          <w:color w:val="1F1F1F"/>
+        </w:rPr>
+        <w:t xml:space="preserve">: Deployed alongside the core staking contracts; stakers exiting an active position may choose to imprint their accrued seniority notch (up to 22) into an immutable ERC-721 credential token;</w:t>
+      </w:r>
+    </w:p>
+    <w:p>
+      <w:pPr>
+        <w:pStyle w:val="ListBullet"/>
+      </w:pPr>
+      <w:r>
+        <w:rPr>
           <w:color w:val="0F5C46"/>
-          <w:u w:val="single"/>
-        </w:rPr>
-        <w:t xml:space="preserve">`SeniorityCertificate.sol`</w:t>
-      </w:r>
-      <w:r>
-        <w:rPr>
-          <w:sz w:val="21"/>
-          <w:color w:val="1F1F1F"/>
-        </w:rPr>
-        <w:t xml:space="preserve">);</w:t>
-      </w:r>
-    </w:p>
-    <w:p>
-      <w:pPr>
-        <w:pStyle w:val="ListBullet"/>
-      </w:pPr>
-      <w:r>
-        <w:rPr>
-          <w:color w:val="0F5C46"/>
         </w:rPr>
         <w:t xml:space="preserve">•  </w:t>
       </w:r>
@@ -3857,7 +3842,7 @@
           <w:sz w:val="21"/>
           <w:color w:val="1F1F1F"/>
         </w:rPr>
-        <w:t xml:space="preserve">: Issuance will burn FATCAT directly to the blackhole dead address </w:t>
+        <w:t xml:space="preserve">: Minting permanently burns </w:t>
       </w:r>
       <w:r>
         <w:rPr>
@@ -3866,41 +3851,14 @@
           <w:color w:val="1C2422"/>
           <w:shd w:val="clear" w:color="auto" w:fill="F3F4F6"/>
         </w:rPr>
-        <w:t xml:space="preserve">0x...dEaD</w:t>
-      </w:r>
-      <w:r>
-        <w:rPr>
-          <w:sz w:val="21"/>
-          <w:color w:val="1F1F1F"/>
-        </w:rPr>
-        <w:t xml:space="preserve">, connecting credential minting to protocol deflation (parameters to be revealed prior to rollout);</w:t>
-      </w:r>
-    </w:p>
-    <w:p>
-      <w:pPr>
-        <w:pStyle w:val="ListBullet"/>
-      </w:pPr>
-      <w:r>
-        <w:rPr>
-          <w:color w:val="0F5C46"/>
-        </w:rPr>
-        <w:t xml:space="preserve">•  </w:t>
-      </w:r>
-      <w:r>
-        <w:rPr>
-          <w:b/>
-          <w:sz w:val="21"/>
-          <w:szCs w:val="21"/>
-          <w:color w:val="1F1F1F"/>
-        </w:rPr>
-        <w:t xml:space="preserve">100% On-Chain SVG Rendering</w:t>
-      </w:r>
-      <w:r>
-        <w:rPr>
-          <w:sz w:val="21"/>
-          <w:color w:val="1F1F1F"/>
-        </w:rPr>
-        <w:t xml:space="preserve">: Dynamic artwork and metadata are computed and rendered purely on-chain as vector SVGs by </w:t>
+        <w:t xml:space="preserve">100_000 FATCAT</w:t>
+      </w:r>
+      <w:r>
+        <w:rPr>
+          <w:sz w:val="21"/>
+          <w:color w:val="1F1F1F"/>
+        </w:rPr>
+        <w:t xml:space="preserve"> directly to the blackhole dead address </w:t>
       </w:r>
       <w:r>
         <w:rPr>
@@ -3909,6 +3867,92 @@
           <w:color w:val="1C2422"/>
           <w:shd w:val="clear" w:color="auto" w:fill="F3F4F6"/>
         </w:rPr>
+        <w:t xml:space="preserve">0x000000000000000000000000000000000000dEaD</w:t>
+      </w:r>
+      <w:r>
+        <w:rPr>
+          <w:sz w:val="21"/>
+          <w:color w:val="1F1F1F"/>
+        </w:rPr>
+        <w:t xml:space="preserve">, coupling credential issuance to protocol deflation;</w:t>
+      </w:r>
+    </w:p>
+    <w:p>
+      <w:pPr>
+        <w:pStyle w:val="ListBullet"/>
+      </w:pPr>
+      <w:r>
+        <w:rPr>
+          <w:color w:val="0F5C46"/>
+        </w:rPr>
+        <w:t xml:space="preserve">•  </w:t>
+      </w:r>
+      <w:r>
+        <w:rPr>
+          <w:b/>
+          <w:sz w:val="21"/>
+          <w:szCs w:val="21"/>
+          <w:color w:val="1F1F1F"/>
+        </w:rPr>
+        <w:t xml:space="preserve">Fixed Hard Cap &amp; Cold-Start Lock</w:t>
+      </w:r>
+      <w:r>
+        <w:rPr>
+          <w:sz w:val="21"/>
+          <w:color w:val="1F1F1F"/>
+        </w:rPr>
+        <w:t xml:space="preserve">: Capped at 10,000 tokens; minting opens once 21 days after deployment (</w:t>
+      </w:r>
+      <w:r>
+        <w:rPr>
+          <w:rFonts w:ascii="Menlo" w:hAnsi="Menlo"/>
+          <w:sz w:val="19"/>
+          <w:color w:val="1C2422"/>
+          <w:shd w:val="clear" w:color="auto" w:fill="F3F4F6"/>
+        </w:rPr>
+        <w:t xml:space="preserve">mintOpensAt = deploy + MINT_DELAY</w:t>
+      </w:r>
+      <w:r>
+        <w:rPr>
+          <w:sz w:val="21"/>
+          <w:color w:val="1F1F1F"/>
+        </w:rPr>
+        <w:t xml:space="preserve">); no per-mint cooldown;</w:t>
+      </w:r>
+    </w:p>
+    <w:p>
+      <w:pPr>
+        <w:pStyle w:val="ListBullet"/>
+      </w:pPr>
+      <w:r>
+        <w:rPr>
+          <w:color w:val="0F5C46"/>
+        </w:rPr>
+        <w:t xml:space="preserve">•  </w:t>
+      </w:r>
+      <w:r>
+        <w:rPr>
+          <w:b/>
+          <w:sz w:val="21"/>
+          <w:szCs w:val="21"/>
+          <w:color w:val="1F1F1F"/>
+        </w:rPr>
+        <w:t xml:space="preserve">100% On-Chain SVG Rendering</w:t>
+      </w:r>
+      <w:r>
+        <w:rPr>
+          <w:sz w:val="21"/>
+          <w:color w:val="1F1F1F"/>
+        </w:rPr>
+        <w:t xml:space="preserve">: Dynamic artwork and metadata are computed and rendered purely on-chain as vector SVGs by </w:t>
+      </w:r>
+      <w:r>
+        <w:rPr>
+          <w:rFonts w:ascii="Menlo" w:hAnsi="Menlo"/>
+          <w:sz w:val="19"/>
+          <w:color w:val="1C2422"/>
+          <w:shd w:val="clear" w:color="auto" w:fill="F3F4F6"/>
+        </w:rPr>
         <w:t xml:space="preserve">SeniorityCertificateRenderer.sol</w:t>
       </w:r>
       <w:r>
@@ -3916,34 +3960,23 @@
           <w:sz w:val="21"/>
           <w:color w:val="1F1F1F"/>
         </w:rPr>
-        <w:t xml:space="preserve"> without centralized servers or IPFS;</w:t>
-      </w:r>
-    </w:p>
-    <w:p>
-      <w:pPr>
-        <w:pStyle w:val="ListBullet"/>
-      </w:pPr>
-      <w:r>
-        <w:rPr>
-          <w:color w:val="0F5C46"/>
-        </w:rPr>
-        <w:t xml:space="preserve">•  </w:t>
-      </w:r>
-      <w:r>
-        <w:rPr>
-          <w:b/>
-          <w:sz w:val="21"/>
-          <w:szCs w:val="21"/>
-          <w:color w:val="1F1F1F"/>
-        </w:rPr>
-        <w:t xml:space="preserve">Phase 2 Deployment Roadmap</w:t>
-      </w:r>
-      <w:r>
-        <w:rPr>
-          <w:sz w:val="21"/>
-          <w:color w:val="1F1F1F"/>
-        </w:rPr>
-        <w:t xml:space="preserve">: Interface integration, exact token burn parameters, and credential utility rules will be formally announced following launch stabilization and liquidity maturation.</w:t>
+        <w:t xml:space="preserve"> and </w:t>
+      </w:r>
+      <w:r>
+        <w:rPr>
+          <w:rFonts w:ascii="Menlo" w:hAnsi="Menlo"/>
+          <w:sz w:val="19"/>
+          <w:color w:val="1C2422"/>
+          <w:shd w:val="clear" w:color="auto" w:fill="F3F4F6"/>
+        </w:rPr>
+        <w:t xml:space="preserve">CertificateData.sol</w:t>
+      </w:r>
+      <w:r>
+        <w:rPr>
+          <w:sz w:val="21"/>
+          <w:color w:val="1F1F1F"/>
+        </w:rPr>
+        <w:t xml:space="preserve"> without centralized servers or IPFS dependencies.</w:t>
       </w:r>
     </w:p>
     <w:p>
@@ -4835,7 +4868,7 @@
           <w:sz w:val="21"/>
           <w:color w:val="1F1F1F"/>
         </w:rPr>
-        <w:t xml:space="preserve"> to poll four routing-related storage values. Detection latency and availability depend on the external monitor, RPC and notification infrastructure; the contract does not guarantee 24/7 or first-block alerting;</w:t>
+        <w:t xml:space="preserve"> to poll eight routing-related read-only functions (recipient addresses, fee allocations, factory pointers, and router binding). Detection latency and availability depend on the external monitor, RPC and notification infrastructure; the contract does not guarantee 24/7 or first-block alerting;</w:t>
       </w:r>
     </w:p>
     <w:p>
@@ -5053,6 +5086,360 @@
           <w:color w:val="1F1F1F"/>
         </w:rPr>
         <w:t xml:space="preserve">FATCAT initiates on the Flap bonding curve without external AMM liquidity. Only after AMM graduation, route verification and oracle initialization may governance add FATCAT through the standard 3-day timelock; listing is not automatic.</w:t>
+      </w:r>
+    </w:p>
+    <w:p>
+      <w:pPr>
+        <w:pStyle w:val="Subtitle"/>
+      </w:pPr>
+      <w:r>
+        <w:t>6.4 Genesis Launch Sequence &amp; Dual-Gate Cold Start</w:t>
+      </w:r>
+    </w:p>
+    <w:p>
+      <w:r>
+        <w:rPr>
+          <w:sz w:val="22"/>
+          <w:color w:val="1F1F1F"/>
+        </w:rPr>
+        <w:t xml:space="preserve">The transition from initial token minting to a continuous dividend-paying state machine is governed by an explicit chronological sequence enforced across physical wall-clock gates:</w:t>
+      </w:r>
+    </w:p>
+    <w:p>
+      <w:pPr>
+        <w:pStyle w:val="CodeBlock"/>
+      </w:pPr>
+      <w:r>
+        <w:rPr>
+          <w:rFonts w:ascii="Menlo" w:hAnsi="Menlo"/>
+          <w:sz w:val="18"/>
+          <w:color w:val="1C2422"/>
+        </w:rPr>
+        <w:t xml:space="preserve">[ Stage 0: Flap Curve ] ──► [ Stage 1: Graduation &amp; Migration ] ──► [ Stage 2: FEED Gate Open ]
+Token trading opens         PancakeSwap V2 pair seeded;             Production staking deployed;
+4% tax accrues to vault     TWAP observations accumulate            Staking deposits open
+                                                                            │
+                                                                            ▼
+[ Stage 4: Steady Emissions ] ◄─── [ Stage 3: 7-Day Dual Wall-Clock Accumulation ]
+Belly releases open via Router;     • Emission Delay: Distributions remain zero for first 7 days
+Batch market execution active       • Vault Outflow Timelock: 7-day spender activation window
+Seniority notches mature (up to 22) • Flap taxes flush to Belly ("accumulate only, zero outflow")</w:t>
+      </w:r>
+    </w:p>
+    <w:p>
+      <w:pPr>
+        <w:pStyle w:val="ListBullet"/>
+      </w:pPr>
+      <w:r>
+        <w:rPr>
+          <w:b/>
+          <w:color w:val="0F5C46"/>
+        </w:rPr>
+        <w:t xml:space="preserve">1.  </w:t>
+      </w:r>
+      <w:r>
+        <w:rPr>
+          <w:b/>
+          <w:sz w:val="21"/>
+          <w:szCs w:val="21"/>
+          <w:color w:val="1F1F1F"/>
+        </w:rPr>
+        <w:t xml:space="preserve">Stage 0: Bonding Curve Launch</w:t>
+      </w:r>
+      <w:r>
+        <w:rPr>
+          <w:sz w:val="21"/>
+          <w:color w:val="1F1F1F"/>
+        </w:rPr>
+        <w:t xml:space="preserve">: FATCAT trading initiates exclusively on Flap's bonding curve. The Flap TaxProcessor recognizes trading volume and routes nominal creator revenue to </w:t>
+      </w:r>
+      <w:r>
+        <w:rPr>
+          <w:rFonts w:ascii="Menlo" w:hAnsi="Menlo"/>
+          <w:sz w:val="19"/>
+          <w:color w:val="1C2422"/>
+          <w:shd w:val="clear" w:color="auto" w:fill="F3F4F6"/>
+        </w:rPr>
+        <w:t xml:space="preserve">FatCatStakingVault</w:t>
+      </w:r>
+      <w:r>
+        <w:rPr>
+          <w:sz w:val="21"/>
+          <w:color w:val="1F1F1F"/>
+        </w:rPr>
+        <w:t xml:space="preserve">;</w:t>
+      </w:r>
+    </w:p>
+    <w:p>
+      <w:pPr>
+        <w:pStyle w:val="ListBullet"/>
+      </w:pPr>
+      <w:r>
+        <w:rPr>
+          <w:b/>
+          <w:color w:val="0F5C46"/>
+        </w:rPr>
+        <w:t xml:space="preserve">2.  </w:t>
+      </w:r>
+      <w:r>
+        <w:rPr>
+          <w:b/>
+          <w:sz w:val="21"/>
+          <w:szCs w:val="21"/>
+          <w:color w:val="1F1F1F"/>
+        </w:rPr>
+        <w:t xml:space="preserve">Stage 1: Graduation &amp; Liquidity Migration</w:t>
+      </w:r>
+      <w:r>
+        <w:rPr>
+          <w:sz w:val="21"/>
+          <w:color w:val="1F1F1F"/>
+        </w:rPr>
+        <w:t xml:space="preserve">: Upon reaching the curve target (24 BNB), Flap atomically migrates liquidity to PancakeSwap V2 (</w:t>
+      </w:r>
+      <w:r>
+        <w:rPr>
+          <w:rFonts w:ascii="Menlo" w:hAnsi="Menlo"/>
+          <w:sz w:val="19"/>
+          <w:color w:val="1C2422"/>
+          <w:shd w:val="clear" w:color="auto" w:fill="F3F4F6"/>
+        </w:rPr>
+        <w:t xml:space="preserve">FATCAT/WBNB</w:t>
+      </w:r>
+      <w:r>
+        <w:rPr>
+          <w:sz w:val="21"/>
+          <w:color w:val="1F1F1F"/>
+        </w:rPr>
+        <w:t xml:space="preserve">), establishing the canonical trading pair. Post-graduation trading tax remains active;</w:t>
+      </w:r>
+    </w:p>
+    <w:p>
+      <w:pPr>
+        <w:pStyle w:val="ListBullet"/>
+      </w:pPr>
+      <w:r>
+        <w:rPr>
+          <w:b/>
+          <w:color w:val="0F5C46"/>
+        </w:rPr>
+        <w:t xml:space="preserve">3.  </w:t>
+      </w:r>
+      <w:r>
+        <w:rPr>
+          <w:b/>
+          <w:sz w:val="21"/>
+          <w:szCs w:val="21"/>
+          <w:color w:val="1F1F1F"/>
+        </w:rPr>
+        <w:t xml:space="preserve">Stage 2: Staking Deployment &amp; FEED Gate</w:t>
+      </w:r>
+      <w:r>
+        <w:rPr>
+          <w:sz w:val="21"/>
+          <w:color w:val="1F1F1F"/>
+        </w:rPr>
+        <w:t xml:space="preserve">: Once live pair routing is verified and TWAP price accumulators are initialized, production staking contracts are deployed. Deposits are unlocked immediately for stakers to secure initial positions;</w:t>
+      </w:r>
+    </w:p>
+    <w:p>
+      <w:pPr>
+        <w:pStyle w:val="ListBullet"/>
+      </w:pPr>
+      <w:r>
+        <w:rPr>
+          <w:b/>
+          <w:color w:val="0F5C46"/>
+        </w:rPr>
+        <w:t xml:space="preserve">4.  </w:t>
+      </w:r>
+      <w:r>
+        <w:rPr>
+          <w:b/>
+          <w:sz w:val="21"/>
+          <w:szCs w:val="21"/>
+          <w:color w:val="1F1F1F"/>
+        </w:rPr>
+        <w:t xml:space="preserve">Stage 3: Dual 7-Day Wall-Clock Accumulation Gates</w:t>
+      </w:r>
+      <w:r>
+        <w:rPr>
+          <w:sz w:val="21"/>
+          <w:color w:val="1F1F1F"/>
+        </w:rPr>
+        <w:t xml:space="preserve">: To eliminate unfair early-block dividend extraction and allow all launch participants to scale their seniority ladders (</w:t>
+      </w:r>
+      <w:r>
+        <w:rPr>
+          <w:i/>
+          <w:sz w:val="21"/>
+          <w:color w:val="1C2422"/>
+        </w:rPr>
+        <w:t xml:space="preserve">c_i \in [1, 22]</w:t>
+      </w:r>
+      <w:r>
+        <w:rPr>
+          <w:sz w:val="21"/>
+          <w:color w:val="1F1F1F"/>
+        </w:rPr>
+        <w:t xml:space="preserve">) on an equal footing, the contracts enforce two parallel physical barriers:</w:t>
+      </w:r>
+    </w:p>
+    <w:p>
+      <w:pPr>
+        <w:pStyle w:val="ListBullet"/>
+      </w:pPr>
+      <w:r>
+        <w:rPr>
+          <w:color w:val="0F5C46"/>
+        </w:rPr>
+        <w:t xml:space="preserve">•  </w:t>
+      </w:r>
+      <w:r>
+        <w:rPr>
+          <w:b/>
+          <w:sz w:val="21"/>
+          <w:szCs w:val="21"/>
+          <w:color w:val="1F1F1F"/>
+        </w:rPr>
+        <w:t xml:space="preserve">Reward Emission Delay</w:t>
+      </w:r>
+      <w:r>
+        <w:rPr>
+          <w:sz w:val="21"/>
+          <w:color w:val="1F1F1F"/>
+        </w:rPr>
+        <w:t xml:space="preserve">: Pinned to an immutable 7-day wall-clock delay. Throughout this window, interval advances rotate the graduation ring and increment staker seniority notches normally, but dividend calculations yield zero. The cold-start week is never retroactively paid;</w:t>
+      </w:r>
+    </w:p>
+    <w:p>
+      <w:pPr>
+        <w:pStyle w:val="ListBullet"/>
+      </w:pPr>
+      <w:r>
+        <w:rPr>
+          <w:color w:val="0F5C46"/>
+        </w:rPr>
+        <w:t xml:space="preserve">•  </w:t>
+      </w:r>
+      <w:r>
+        <w:rPr>
+          <w:b/>
+          <w:sz w:val="21"/>
+          <w:szCs w:val="21"/>
+          <w:color w:val="1F1F1F"/>
+        </w:rPr>
+        <w:t xml:space="preserve">Treasury Outflow Delay</w:t>
+      </w:r>
+      <w:r>
+        <w:rPr>
+          <w:sz w:val="21"/>
+          <w:color w:val="1F1F1F"/>
+        </w:rPr>
+        <w:t xml:space="preserve">: The authorized </w:t>
+      </w:r>
+      <w:r>
+        <w:rPr>
+          <w:rFonts w:ascii="Menlo" w:hAnsi="Menlo"/>
+          <w:sz w:val="19"/>
+          <w:color w:val="1C2422"/>
+          <w:shd w:val="clear" w:color="auto" w:fill="F3F4F6"/>
+        </w:rPr>
+        <w:t xml:space="preserve">ExecutionRouter</w:t>
+      </w:r>
+      <w:r>
+        <w:rPr>
+          <w:sz w:val="21"/>
+          <w:color w:val="1F1F1F"/>
+        </w:rPr>
+        <w:t xml:space="preserve"> proposal must wait for a 7-day physical timelock before activation. During this period, The Belly has zero active spenders, guaranteeing zero capital drawdown;</w:t>
+      </w:r>
+    </w:p>
+    <w:p>
+      <w:pPr>
+        <w:pStyle w:val="ListBullet"/>
+      </w:pPr>
+      <w:r>
+        <w:rPr>
+          <w:color w:val="0F5C46"/>
+        </w:rPr>
+        <w:t xml:space="preserve">•  </w:t>
+      </w:r>
+      <w:r>
+        <w:rPr>
+          <w:b/>
+          <w:sz w:val="21"/>
+          <w:szCs w:val="21"/>
+          <w:color w:val="1F1F1F"/>
+        </w:rPr>
+        <w:t xml:space="preserve">Reservoir Buffer Build-Up</w:t>
+      </w:r>
+      <w:r>
+        <w:rPr>
+          <w:sz w:val="21"/>
+          <w:color w:val="1F1F1F"/>
+        </w:rPr>
+        <w:t xml:space="preserve">: Taxes collected from PancakeSwap volume continue to be forwarded via </w:t>
+      </w:r>
+      <w:r>
+        <w:rPr>
+          <w:rFonts w:ascii="Menlo" w:hAnsi="Menlo"/>
+          <w:sz w:val="19"/>
+          <w:color w:val="1C2422"/>
+          <w:shd w:val="clear" w:color="auto" w:fill="F3F4F6"/>
+        </w:rPr>
+        <w:t xml:space="preserve">flush()</w:t>
+      </w:r>
+      <w:r>
+        <w:rPr>
+          <w:sz w:val="21"/>
+          <w:color w:val="1F1F1F"/>
+        </w:rPr>
+        <w:t xml:space="preserve">, filling The Belly with quote reserves;</w:t>
+      </w:r>
+    </w:p>
+    <w:p>
+      <w:pPr>
+        <w:pStyle w:val="ListBullet"/>
+      </w:pPr>
+      <w:r>
+        <w:rPr>
+          <w:b/>
+          <w:color w:val="0F5C46"/>
+        </w:rPr>
+        <w:t xml:space="preserve">5.  </w:t>
+      </w:r>
+      <w:r>
+        <w:rPr>
+          <w:b/>
+          <w:sz w:val="21"/>
+          <w:szCs w:val="21"/>
+          <w:color w:val="1F1F1F"/>
+        </w:rPr>
+        <w:t xml:space="preserve">Stage 4: Steady-State Protocol Emissions</w:t>
+      </w:r>
+      <w:r>
+        <w:rPr>
+          <w:sz w:val="21"/>
+          <w:color w:val="1F1F1F"/>
+        </w:rPr>
+        <w:t xml:space="preserve">: Following the expiration of both 7-day gates, </w:t>
+      </w:r>
+      <w:r>
+        <w:rPr>
+          <w:rFonts w:ascii="Menlo" w:hAnsi="Menlo"/>
+          <w:sz w:val="19"/>
+          <w:color w:val="1C2422"/>
+          <w:shd w:val="clear" w:color="auto" w:fill="F3F4F6"/>
+        </w:rPr>
+        <w:t xml:space="preserve">ExecutionRouter</w:t>
+      </w:r>
+      <w:r>
+        <w:rPr>
+          <w:sz w:val="21"/>
+          <w:color w:val="1F1F1F"/>
+        </w:rPr>
+        <w:t xml:space="preserve"> is permanently activated. Protocol releases begin, distributing quote reserves according to the discrete damping formula to stakers holding mature seniority weights.</w:t>
       </w:r>
     </w:p>
     <w:p>
@@ -5110,7 +5497,7 @@
           <w:szCs w:val="22"/>
           <w:color w:val="1F1F1F"/>
         </w:rPr>
-        <w:t xml:space="preserve">74 suites / 538 tests / 0 failures</w:t>
+        <w:t xml:space="preserve">78+ suites / 582 tests / 0 failures</w:t>
       </w:r>
       <w:r>
         <w:rPr>
@@ -9606,21 +9993,21 @@
                 <w:color w:val="1C2422"/>
                 <w:shd w:val="clear" w:color="auto" w:fill="F3F4F6"/>
               </w:rPr>
-              <w:t xml:space="preserve">0x... (Pending Deployment)</w:t>
-            </w:r>
-          </w:p>
-        </w:tc>
-        <w:tc>
-          <w:p>
-            <w:pPr>
-              <w:spacing w:before="40" w:after="40"/>
-            </w:pPr>
-            <w:r>
-              <w:rPr>
-                <w:sz w:val="19"/>
-                <w:color w:val="1F1F1F"/>
-              </w:rPr>
-              <w:t xml:space="preserve">1,000,000,000 fixed supply, zero presale, immutable implementation pointer</w:t>
+              <w:t xml:space="preserve">0x... (Pending Launch)</w:t>
+            </w:r>
+          </w:p>
+        </w:tc>
+        <w:tc>
+          <w:p>
+            <w:pPr>
+              <w:spacing w:before="40" w:after="40"/>
+            </w:pPr>
+            <w:r>
+              <w:rPr>
+                <w:sz w:val="19"/>
+                <w:color w:val="1F1F1F"/>
+              </w:rPr>
+              <w:t xml:space="preserve">1,000,000,000 fixed supply, zero presale, immutable BEP-20 implementation</w:t>
             </w:r>
           </w:p>
         </w:tc>
@@ -9682,7 +10069,23 @@
                 <w:sz w:val="19"/>
                 <w:color w:val="1F1F1F"/>
               </w:rPr>
-              <w:t xml:space="preserve">Post-graduation liquidity pool, cumulative price accumulator source</w:t>
+              <w:t xml:space="preserve">Post-graduation liquidity pool (</w:t>
+            </w:r>
+            <w:r>
+              <w:rPr>
+                <w:rFonts w:ascii="Menlo" w:hAnsi="Menlo"/>
+                <w:sz w:val="17"/>
+                <w:color w:val="1C2422"/>
+                <w:shd w:val="clear" w:color="auto" w:fill="F3F4F6"/>
+              </w:rPr>
+              <w:t xml:space="preserve">FATCAT/WBNB</w:t>
+            </w:r>
+            <w:r>
+              <w:rPr>
+                <w:sz w:val="19"/>
+                <w:color w:val="1F1F1F"/>
+              </w:rPr>
+              <w:t xml:space="preserve">), cumulative TWAP price accumulator source</w:t>
             </w:r>
           </w:p>
         </w:tc>
@@ -9700,7 +10103,7 @@
                 <w:szCs w:val="19"/>
                 <w:color w:val="1F1F1F"/>
               </w:rPr>
-              <w:t xml:space="preserve">The Belly</w:t>
+              <w:t xml:space="preserve">FatCatStakingVault</w:t>
             </w:r>
           </w:p>
         </w:tc>
@@ -9744,7 +10147,7 @@
                 <w:sz w:val="19"/>
                 <w:color w:val="1F1F1F"/>
               </w:rPr>
-              <w:t xml:space="preserve">Unprivileged first-order damping reservoir, no sweep, no rescue</w:t>
+              <w:t xml:space="preserve">Flap V3 tax router; delta recognition, wraps to WBNB, splits 5/36 to Ops Safe &amp; 31/36 to Belly</w:t>
             </w:r>
           </w:p>
         </w:tc>
@@ -9762,7 +10165,7 @@
                 <w:szCs w:val="19"/>
                 <w:color w:val="1F1F1F"/>
               </w:rPr>
-              <w:t xml:space="preserve">StakingVault</w:t>
+              <w:t xml:space="preserve">FatCatStakingVaultFactory</w:t>
             </w:r>
           </w:p>
         </w:tc>
@@ -9806,7 +10209,7 @@
                 <w:sz w:val="19"/>
                 <w:color w:val="1F1F1F"/>
               </w:rPr>
-              <w:t xml:space="preserve">Isolated position custody; redemption deliberately bypasses pause</w:t>
+              <w:t xml:space="preserve">Factory deploying beacon instances for Flap VaultPortal integration</w:t>
             </w:r>
           </w:p>
         </w:tc>
@@ -9824,7 +10227,7 @@
                 <w:szCs w:val="19"/>
                 <w:color w:val="1F1F1F"/>
               </w:rPr>
-              <w:t xml:space="preserve">SeniorityLedger</w:t>
+              <w:t xml:space="preserve">The Belly</w:t>
             </w:r>
           </w:p>
         </w:tc>
@@ -9868,7 +10271,7 @@
                 <w:sz w:val="19"/>
                 <w:color w:val="1F1F1F"/>
               </w:rPr>
-              <w:t xml:space="preserve"/>
+              <w:t xml:space="preserve">Exponential damping reservoir; window outflow cap </w:t>
             </w:r>
             <w:r>
               <w:rPr>
@@ -9876,14 +10279,14 @@
                 <w:sz w:val="19"/>
                 <w:color w:val="1C2422"/>
               </w:rPr>
-              <w:t xml:space="preserve">O(1)</w:t>
-            </w:r>
-            <w:r>
-              <w:rPr>
-                <w:sz w:val="19"/>
-                <w:color w:val="1F1F1F"/>
-              </w:rPr>
-              <w:t xml:space="preserve"> closed-form weight aggregation and RAY-scaled dual prefix accumulators</w:t>
+              <w:t xml:space="preserve">\le 16/168</w:t>
+            </w:r>
+            <w:r>
+              <w:rPr>
+                <w:sz w:val="19"/>
+                <w:color w:val="1F1F1F"/>
+              </w:rPr>
+              <w:t xml:space="preserve">, write-once spender</w:t>
             </w:r>
           </w:p>
         </w:tc>
@@ -9901,7 +10304,7 @@
                 <w:szCs w:val="19"/>
                 <w:color w:val="1F1F1F"/>
               </w:rPr>
-              <w:t xml:space="preserve">RewardAssetRegistry</w:t>
+              <w:t xml:space="preserve">StakingVault</w:t>
             </w:r>
           </w:p>
         </w:tc>
@@ -9945,7 +10348,23 @@
                 <w:sz w:val="19"/>
                 <w:color w:val="1F1F1F"/>
               </w:rPr>
-              <w:t xml:space="preserve">MENU whitelist registry and 5% probation allocation cap controller</w:t>
+              <w:t xml:space="preserve">Custodies staked principal; unpausable </w:t>
+            </w:r>
+            <w:r>
+              <w:rPr>
+                <w:rFonts w:ascii="Menlo" w:hAnsi="Menlo"/>
+                <w:sz w:val="17"/>
+                <w:color w:val="1C2422"/>
+                <w:shd w:val="clear" w:color="auto" w:fill="F3F4F6"/>
+              </w:rPr>
+              <w:t xml:space="preserve">redeem()</w:t>
+            </w:r>
+            <w:r>
+              <w:rPr>
+                <w:sz w:val="19"/>
+                <w:color w:val="1F1F1F"/>
+              </w:rPr>
+              <w:t xml:space="preserve">, 100k floor, certificate linkage</w:t>
             </w:r>
           </w:p>
         </w:tc>
@@ -9963,7 +10382,7 @@
                 <w:szCs w:val="19"/>
                 <w:color w:val="1F1F1F"/>
               </w:rPr>
-              <w:t xml:space="preserve">ExecutionRouter</w:t>
+              <w:t xml:space="preserve">SeniorityLedger</w:t>
             </w:r>
           </w:p>
         </w:tc>
@@ -10007,7 +10426,22 @@
                 <w:sz w:val="19"/>
                 <w:color w:val="1F1F1F"/>
               </w:rPr>
-              <w:t xml:space="preserve">Delayed one-time activation, MEV-protected market batch swapper</w:t>
+              <w:t xml:space="preserve"/>
+            </w:r>
+            <w:r>
+              <w:rPr>
+                <w:i/>
+                <w:sz w:val="19"/>
+                <w:color w:val="1C2422"/>
+              </w:rPr>
+              <w:t xml:space="preserve">O(1)</w:t>
+            </w:r>
+            <w:r>
+              <w:rPr>
+                <w:sz w:val="19"/>
+                <w:color w:val="1F1F1F"/>
+              </w:rPr>
+              <w:t xml:space="preserve"> closed-form weight aggregation and RAY-scaled dual prefix accumulators</w:t>
             </w:r>
           </w:p>
         </w:tc>
@@ -10025,7 +10459,7 @@
                 <w:szCs w:val="19"/>
                 <w:color w:val="1F1F1F"/>
               </w:rPr>
-              <w:t xml:space="preserve">RewardDistributor</w:t>
+              <w:t xml:space="preserve">LaunchIntervalController</w:t>
             </w:r>
           </w:p>
         </w:tc>
@@ -10069,7 +10503,22 @@
                 <w:sz w:val="19"/>
                 <w:color w:val="1F1F1F"/>
               </w:rPr>
-              <w:t xml:space="preserve">Dual-liability accounting and integer floor division solvency custody</w:t>
+              <w:t xml:space="preserve">Production clock engine (</w:t>
+            </w:r>
+            <w:r>
+              <w:rPr>
+                <w:i/>
+                <w:sz w:val="19"/>
+                <w:color w:val="1C2422"/>
+              </w:rPr>
+              <w:t xml:space="preserve">\ge 8\text{h}</w:t>
+            </w:r>
+            <w:r>
+              <w:rPr>
+                <w:sz w:val="19"/>
+                <w:color w:val="1F1F1F"/>
+              </w:rPr>
+              <w:t xml:space="preserve"> cadence), 7-day wall-clock accumulation period</w:t>
             </w:r>
           </w:p>
         </w:tc>
@@ -10087,7 +10536,7 @@
                 <w:szCs w:val="19"/>
                 <w:color w:val="1F1F1F"/>
               </w:rPr>
-              <w:t xml:space="preserve">SeniorityCertificate (ERC-721)</w:t>
+              <w:t xml:space="preserve">InitialRewardAssetRegistry</w:t>
             </w:r>
           </w:p>
         </w:tc>
@@ -10131,7 +10580,7 @@
                 <w:sz w:val="19"/>
                 <w:color w:val="1F1F1F"/>
               </w:rPr>
-              <w:t xml:space="preserve">Post-launch roadmap; burns FATCAT on exit to imprint seniority tier, 100% on-chain SVG</w:t>
+              <w:t xml:space="preserve">Production MENU whitelist with signed constructor menu exempt from probation</w:t>
             </w:r>
           </w:p>
         </w:tc>
@@ -10149,7 +10598,7 @@
                 <w:szCs w:val="19"/>
                 <w:color w:val="1F1F1F"/>
               </w:rPr>
-              <w:t xml:space="preserve">PancakeV2TwapOracle</w:t>
+              <w:t xml:space="preserve">ExecutionRouter</w:t>
             </w:r>
           </w:p>
         </w:tc>
@@ -10193,7 +10642,441 @@
                 <w:sz w:val="19"/>
                 <w:color w:val="1F1F1F"/>
               </w:rPr>
+              <w:t xml:space="preserve">Permanent write-once router, MEV-guarded batch market swapper &amp; fallback</w:t>
+            </w:r>
+          </w:p>
+        </w:tc>
+      </w:tr>
+      <w:tr>
+        <w:tc>
+          <w:p>
+            <w:pPr>
+              <w:spacing w:before="40" w:after="40"/>
+            </w:pPr>
+            <w:r>
+              <w:rPr>
+                <w:b/>
+                <w:sz w:val="19"/>
+                <w:szCs w:val="19"/>
+                <w:color w:val="1F1F1F"/>
+              </w:rPr>
+              <w:t xml:space="preserve">RewardDistributor</w:t>
+            </w:r>
+          </w:p>
+        </w:tc>
+        <w:tc>
+          <w:p>
+            <w:pPr>
+              <w:spacing w:before="40" w:after="40"/>
+            </w:pPr>
+            <w:r>
+              <w:rPr>
+                <w:sz w:val="19"/>
+                <w:color w:val="1F1F1F"/>
+              </w:rPr>
+              <w:t xml:space="preserve">BNB Chain Mainnet</w:t>
+            </w:r>
+          </w:p>
+        </w:tc>
+        <w:tc>
+          <w:p>
+            <w:pPr>
+              <w:spacing w:before="40" w:after="40"/>
+            </w:pPr>
+            <w:r>
+              <w:rPr>
+                <w:rFonts w:ascii="Menlo" w:hAnsi="Menlo"/>
+                <w:sz w:val="17"/>
+                <w:color w:val="1C2422"/>
+                <w:shd w:val="clear" w:color="auto" w:fill="F3F4F6"/>
+              </w:rPr>
+              <w:t xml:space="preserve">0x... (Pending Deployment)</w:t>
+            </w:r>
+          </w:p>
+        </w:tc>
+        <w:tc>
+          <w:p>
+            <w:pPr>
+              <w:spacing w:before="40" w:after="40"/>
+            </w:pPr>
+            <w:r>
+              <w:rPr>
+                <w:sz w:val="19"/>
+                <w:color w:val="1F1F1F"/>
+              </w:rPr>
+              <w:t xml:space="preserve">Dual-liability accounting and integer floor division solvency custody</w:t>
+            </w:r>
+          </w:p>
+        </w:tc>
+      </w:tr>
+      <w:tr>
+        <w:tc>
+          <w:p>
+            <w:pPr>
+              <w:spacing w:before="40" w:after="40"/>
+            </w:pPr>
+            <w:r>
+              <w:rPr>
+                <w:b/>
+                <w:sz w:val="19"/>
+                <w:szCs w:val="19"/>
+                <w:color w:val="1F1F1F"/>
+              </w:rPr>
+              <w:t xml:space="preserve">SeniorityCertificate (ERC-721)</w:t>
+            </w:r>
+          </w:p>
+        </w:tc>
+        <w:tc>
+          <w:p>
+            <w:pPr>
+              <w:spacing w:before="40" w:after="40"/>
+            </w:pPr>
+            <w:r>
+              <w:rPr>
+                <w:sz w:val="19"/>
+                <w:color w:val="1F1F1F"/>
+              </w:rPr>
+              <w:t xml:space="preserve">BNB Chain Mainnet</w:t>
+            </w:r>
+          </w:p>
+        </w:tc>
+        <w:tc>
+          <w:p>
+            <w:pPr>
+              <w:spacing w:before="40" w:after="40"/>
+            </w:pPr>
+            <w:r>
+              <w:rPr>
+                <w:rFonts w:ascii="Menlo" w:hAnsi="Menlo"/>
+                <w:sz w:val="17"/>
+                <w:color w:val="1C2422"/>
+                <w:shd w:val="clear" w:color="auto" w:fill="F3F4F6"/>
+              </w:rPr>
+              <w:t xml:space="preserve">0x... (Pending Deployment)</w:t>
+            </w:r>
+          </w:p>
+        </w:tc>
+        <w:tc>
+          <w:p>
+            <w:pPr>
+              <w:spacing w:before="40" w:after="40"/>
+            </w:pPr>
+            <w:r>
+              <w:rPr>
+                <w:sz w:val="19"/>
+                <w:color w:val="1F1F1F"/>
+              </w:rPr>
+              <w:t xml:space="preserve">Genesis exit credential; burn 100k FATCAT to mint, 10k cap, 21d delay, 100% on-chain SVG</w:t>
+            </w:r>
+          </w:p>
+        </w:tc>
+      </w:tr>
+      <w:tr>
+        <w:tc>
+          <w:p>
+            <w:pPr>
+              <w:spacing w:before="40" w:after="40"/>
+            </w:pPr>
+            <w:r>
+              <w:rPr>
+                <w:b/>
+                <w:sz w:val="19"/>
+                <w:szCs w:val="19"/>
+                <w:color w:val="1F1F1F"/>
+              </w:rPr>
+              <w:t xml:space="preserve">SeniorityCertificateRenderer</w:t>
+            </w:r>
+          </w:p>
+        </w:tc>
+        <w:tc>
+          <w:p>
+            <w:pPr>
+              <w:spacing w:before="40" w:after="40"/>
+            </w:pPr>
+            <w:r>
+              <w:rPr>
+                <w:sz w:val="19"/>
+                <w:color w:val="1F1F1F"/>
+              </w:rPr>
+              <w:t xml:space="preserve">BNB Chain Mainnet</w:t>
+            </w:r>
+          </w:p>
+        </w:tc>
+        <w:tc>
+          <w:p>
+            <w:pPr>
+              <w:spacing w:before="40" w:after="40"/>
+            </w:pPr>
+            <w:r>
+              <w:rPr>
+                <w:rFonts w:ascii="Menlo" w:hAnsi="Menlo"/>
+                <w:sz w:val="17"/>
+                <w:color w:val="1C2422"/>
+                <w:shd w:val="clear" w:color="auto" w:fill="F3F4F6"/>
+              </w:rPr>
+              <w:t xml:space="preserve">0x... (Pending Deployment)</w:t>
+            </w:r>
+          </w:p>
+        </w:tc>
+        <w:tc>
+          <w:p>
+            <w:pPr>
+              <w:spacing w:before="40" w:after="40"/>
+            </w:pPr>
+            <w:r>
+              <w:rPr>
+                <w:sz w:val="19"/>
+                <w:color w:val="1F1F1F"/>
+              </w:rPr>
+              <w:t xml:space="preserve">Pure on-chain SVG generator rendering dynamic visual attributes</w:t>
+            </w:r>
+          </w:p>
+        </w:tc>
+      </w:tr>
+      <w:tr>
+        <w:tc>
+          <w:p>
+            <w:pPr>
+              <w:spacing w:before="40" w:after="40"/>
+            </w:pPr>
+            <w:r>
+              <w:rPr>
+                <w:b/>
+                <w:sz w:val="19"/>
+                <w:szCs w:val="19"/>
+                <w:color w:val="1F1F1F"/>
+              </w:rPr>
+              <w:t xml:space="preserve">CertificateData</w:t>
+            </w:r>
+          </w:p>
+        </w:tc>
+        <w:tc>
+          <w:p>
+            <w:pPr>
+              <w:spacing w:before="40" w:after="40"/>
+            </w:pPr>
+            <w:r>
+              <w:rPr>
+                <w:sz w:val="19"/>
+                <w:color w:val="1F1F1F"/>
+              </w:rPr>
+              <w:t xml:space="preserve">BNB Chain Mainnet</w:t>
+            </w:r>
+          </w:p>
+        </w:tc>
+        <w:tc>
+          <w:p>
+            <w:pPr>
+              <w:spacing w:before="40" w:after="40"/>
+            </w:pPr>
+            <w:r>
+              <w:rPr>
+                <w:rFonts w:ascii="Menlo" w:hAnsi="Menlo"/>
+                <w:sz w:val="17"/>
+                <w:color w:val="1C2422"/>
+                <w:shd w:val="clear" w:color="auto" w:fill="F3F4F6"/>
+              </w:rPr>
+              <w:t xml:space="preserve">0x... (Pending Deployment)</w:t>
+            </w:r>
+          </w:p>
+        </w:tc>
+        <w:tc>
+          <w:p>
+            <w:pPr>
+              <w:spacing w:before="40" w:after="40"/>
+            </w:pPr>
+            <w:r>
+              <w:rPr>
+                <w:sz w:val="19"/>
+                <w:color w:val="1F1F1F"/>
+              </w:rPr>
+              <w:t xml:space="preserve">Bytecode container storing compressed fonts and vector artwork data</w:t>
+            </w:r>
+          </w:p>
+        </w:tc>
+      </w:tr>
+      <w:tr>
+        <w:tc>
+          <w:p>
+            <w:pPr>
+              <w:spacing w:before="40" w:after="40"/>
+            </w:pPr>
+            <w:r>
+              <w:rPr>
+                <w:b/>
+                <w:sz w:val="19"/>
+                <w:szCs w:val="19"/>
+                <w:color w:val="1F1F1F"/>
+              </w:rPr>
+              <w:t xml:space="preserve">PancakeV2TwapOracle</w:t>
+            </w:r>
+          </w:p>
+        </w:tc>
+        <w:tc>
+          <w:p>
+            <w:pPr>
+              <w:spacing w:before="40" w:after="40"/>
+            </w:pPr>
+            <w:r>
+              <w:rPr>
+                <w:sz w:val="19"/>
+                <w:color w:val="1F1F1F"/>
+              </w:rPr>
+              <w:t xml:space="preserve">BNB Chain Mainnet</w:t>
+            </w:r>
+          </w:p>
+        </w:tc>
+        <w:tc>
+          <w:p>
+            <w:pPr>
+              <w:spacing w:before="40" w:after="40"/>
+            </w:pPr>
+            <w:r>
+              <w:rPr>
+                <w:rFonts w:ascii="Menlo" w:hAnsi="Menlo"/>
+                <w:sz w:val="17"/>
+                <w:color w:val="1C2422"/>
+                <w:shd w:val="clear" w:color="auto" w:fill="F3F4F6"/>
+              </w:rPr>
+              <w:t xml:space="preserve">0x... (Pending Deployment)</w:t>
+            </w:r>
+          </w:p>
+        </w:tc>
+        <w:tc>
+          <w:p>
+            <w:pPr>
+              <w:spacing w:before="40" w:after="40"/>
+            </w:pPr>
+            <w:r>
+              <w:rPr>
+                <w:sz w:val="19"/>
+                <w:color w:val="1F1F1F"/>
+              </w:rPr>
               <w:t xml:space="preserve">Reads separated V2 Pair price accumulators to compute execution TWAP bounds</w:t>
+            </w:r>
+          </w:p>
+        </w:tc>
+      </w:tr>
+      <w:tr>
+        <w:tc>
+          <w:p>
+            <w:pPr>
+              <w:spacing w:before="40" w:after="40"/>
+            </w:pPr>
+            <w:r>
+              <w:rPr>
+                <w:b/>
+                <w:sz w:val="19"/>
+                <w:szCs w:val="19"/>
+                <w:color w:val="1F1F1F"/>
+              </w:rPr>
+              <w:t xml:space="preserve">PancakeV3Adapter</w:t>
+            </w:r>
+          </w:p>
+        </w:tc>
+        <w:tc>
+          <w:p>
+            <w:pPr>
+              <w:spacing w:before="40" w:after="40"/>
+            </w:pPr>
+            <w:r>
+              <w:rPr>
+                <w:sz w:val="19"/>
+                <w:color w:val="1F1F1F"/>
+              </w:rPr>
+              <w:t xml:space="preserve">BNB Chain Mainnet</w:t>
+            </w:r>
+          </w:p>
+        </w:tc>
+        <w:tc>
+          <w:p>
+            <w:pPr>
+              <w:spacing w:before="40" w:after="40"/>
+            </w:pPr>
+            <w:r>
+              <w:rPr>
+                <w:rFonts w:ascii="Menlo" w:hAnsi="Menlo"/>
+                <w:sz w:val="17"/>
+                <w:color w:val="1C2422"/>
+                <w:shd w:val="clear" w:color="auto" w:fill="F3F4F6"/>
+              </w:rPr>
+              <w:t xml:space="preserve">0x... (Pending Deployment)</w:t>
+            </w:r>
+          </w:p>
+        </w:tc>
+        <w:tc>
+          <w:p>
+            <w:pPr>
+              <w:spacing w:before="40" w:after="40"/>
+            </w:pPr>
+            <w:r>
+              <w:rPr>
+                <w:sz w:val="19"/>
+                <w:color w:val="1F1F1F"/>
+              </w:rPr>
+              <w:t xml:space="preserve">Production execution adapter executing multi-hop swaps across Pancake V3 pools</w:t>
+            </w:r>
+          </w:p>
+        </w:tc>
+      </w:tr>
+      <w:tr>
+        <w:tc>
+          <w:p>
+            <w:pPr>
+              <w:spacing w:before="40" w:after="40"/>
+            </w:pPr>
+            <w:r>
+              <w:rPr>
+                <w:b/>
+                <w:sz w:val="19"/>
+                <w:szCs w:val="19"/>
+                <w:color w:val="1F1F1F"/>
+              </w:rPr>
+              <w:t xml:space="preserve">PancakeV3TwoHopTwapOracle</w:t>
+            </w:r>
+          </w:p>
+        </w:tc>
+        <w:tc>
+          <w:p>
+            <w:pPr>
+              <w:spacing w:before="40" w:after="40"/>
+            </w:pPr>
+            <w:r>
+              <w:rPr>
+                <w:sz w:val="19"/>
+                <w:color w:val="1F1F1F"/>
+              </w:rPr>
+              <w:t xml:space="preserve">BNB Chain Mainnet</w:t>
+            </w:r>
+          </w:p>
+        </w:tc>
+        <w:tc>
+          <w:p>
+            <w:pPr>
+              <w:spacing w:before="40" w:after="40"/>
+            </w:pPr>
+            <w:r>
+              <w:rPr>
+                <w:rFonts w:ascii="Menlo" w:hAnsi="Menlo"/>
+                <w:sz w:val="17"/>
+                <w:color w:val="1C2422"/>
+                <w:shd w:val="clear" w:color="auto" w:fill="F3F4F6"/>
+              </w:rPr>
+              <w:t xml:space="preserve">0x... (Pending Deployment)</w:t>
+            </w:r>
+          </w:p>
+        </w:tc>
+        <w:tc>
+          <w:p>
+            <w:pPr>
+              <w:spacing w:before="40" w:after="40"/>
+            </w:pPr>
+            <w:r>
+              <w:rPr>
+                <w:sz w:val="19"/>
+                <w:color w:val="1F1F1F"/>
+              </w:rPr>
+              <w:t xml:space="preserve">Two-hop V3 TWAP oracle (WBNB -&gt; USDT -&gt; bStock) for equity feeds</w:t>
             </w:r>
           </w:p>
         </w:tc>
@@ -10242,7 +11125,7 @@
           <w:szCs w:val="21"/>
           <w:color w:val="1F1F1F"/>
         </w:rPr>
-        <w:t xml:space="preserve">Official Security Contact Email</w:t>
+        <w:t xml:space="preserve">Official Security Channel</w:t>
       </w:r>
       <w:r>
         <w:rPr>
@@ -10255,12 +11138,25 @@
     <w:p>
       <w:r>
         <w:rPr>
-          <w:rFonts w:ascii="Menlo" w:hAnsi="Menlo"/>
-          <w:sz w:val="20"/>
-          <w:color w:val="1C2422"/>
-          <w:shd w:val="clear" w:color="auto" w:fill="F3F4F6"/>
-        </w:rPr>
-        <w:t xml:space="preserve">security@thefatcat.fun</w:t>
+          <w:sz w:val="22"/>
+          <w:color w:val="1F1F1F"/>
+        </w:rPr>
+        <w:t xml:space="preserve">Please submit vulnerability disclosures through the official </w:t>
+      </w:r>
+      <w:r>
+        <w:rPr>
+          <w:sz w:val="22"/>
+          <w:color w:val="0F5C46"/>
+          <w:u w:val="single"/>
+        </w:rPr>
+        <w:t xml:space="preserve">GitHub Private Security Advisory Channel</w:t>
+      </w:r>
+      <w:r>
+        <w:rPr>
+          <w:sz w:val="22"/>
+          <w:color w:val="1F1F1F"/>
+        </w:rPr>
+        <w:t xml:space="preserve">.</w:t>
       </w:r>
     </w:p>
     <w:p>
@@ -10297,7 +11193,7 @@
           <w:sz w:val="22"/>
           <w:color w:val="1F1F1F"/>
         </w:rPr>
-        <w:t xml:space="preserve">When submitting reports concerning fund safety, logic vulnerabilities, or privilege escalation risks, please encrypt sensitive disclosures using the protocol's official PGP public key (the key fingerprint will be published upon mainnet deployment on official GitHub and website channels).</w:t>
+        <w:t xml:space="preserve">When submitting disclosures containing sensitive vulnerability details or exploit proofs, technical attachments may additionally be encrypted using the protocol's official PGP key (fingerprint published upon mainnet launch).</w:t>
       </w:r>
     </w:p>
     <w:p>
@@ -10318,7 +11214,7 @@
           <w:szCs w:val="21"/>
           <w:color w:val="1F1F1F"/>
         </w:rPr>
-        <w:t xml:space="preserve">Response &amp; Triage Commitments</w:t>
+        <w:t xml:space="preserve">Review &amp; Feedback Policy</w:t>
       </w:r>
       <w:r>
         <w:rPr>
@@ -10345,41 +11241,14 @@
           <w:szCs w:val="21"/>
           <w:color w:val="1F1F1F"/>
         </w:rPr>
-        <w:t xml:space="preserve">24-Hour Acknowledgment</w:t>
-      </w:r>
-      <w:r>
-        <w:rPr>
-          <w:sz w:val="21"/>
-          <w:color w:val="1F1F1F"/>
-        </w:rPr>
-        <w:t xml:space="preserve">: The security team commits to acknowledging receipt and initiating local reproduction within 24 hours of submission;</w:t>
-      </w:r>
-    </w:p>
-    <w:p>
-      <w:pPr>
-        <w:pStyle w:val="ListBullet"/>
-      </w:pPr>
-      <w:r>
-        <w:rPr>
-          <w:color w:val="0F5C46"/>
-        </w:rPr>
-        <w:t xml:space="preserve">•  </w:t>
-      </w:r>
-      <w:r>
-        <w:rPr>
-          <w:b/>
-          <w:sz w:val="21"/>
-          <w:szCs w:val="21"/>
-          <w:color w:val="1F1F1F"/>
-        </w:rPr>
-        <w:t xml:space="preserve">48-Hour Classification</w:t>
-      </w:r>
-      <w:r>
-        <w:rPr>
-          <w:sz w:val="21"/>
-          <w:color w:val="1F1F1F"/>
-        </w:rPr>
-        <w:t xml:space="preserve">: An initial severity classification and collaborative remediation timeline will be provided within 48 hours;</w:t>
+        <w:t xml:space="preserve">Regular Review &amp; Prompt Feedback</w:t>
+      </w:r>
+      <w:r>
+        <w:rPr>
+          <w:sz w:val="21"/>
+          <w:color w:val="1F1F1F"/>
+        </w:rPr>
+        <w:t xml:space="preserve">: The security team regularly reviews incoming disclosures and provides rapid triage feedback upon evaluation;</w:t>
       </w:r>
     </w:p>
     <w:p>

</xml_diff>

<commit_message>
docs: align whitepaper and guides with contracts, de-hype language, and mark seniority certificates as upcoming release
</commit_message>
<xml_diff>
--- a/assets/whitepaper/TheFatCat_Whitepaper_v1.0_EN.docx
+++ b/assets/whitepaper/TheFatCat_Whitepaper_v1.0_EN.docx
@@ -29,7 +29,7 @@
           <w:szCs w:val="19"/>
           <w:color w:val="4B5563"/>
         </w:rPr>
-        <w:t xml:space="preserve">Version: 1.0 Official Release | Date: September 15, 2026</w:t>
+        <w:t xml:space="preserve">Version: 1.0 Official Release | Date: September 20, 2026</w:t>
       </w:r>
     </w:p>
     <w:p>
@@ -40,7 +40,7 @@
           <w:szCs w:val="22"/>
           <w:color w:val="1F1F1F"/>
         </w:rPr>
-        <w:t xml:space="preserve">Derived from Project Plan v0.5 and checked against the current contract source and launch configuration. Equations identified as analytical models state their assumptions explicitly. The ordinary production path assumes no seniority head start; the current worktree's explicitly non-deployable `stakeWithHead` experiment is outside this specification and must not ship in the release build. This document contains no projected returns or promises of yield.</w:t>
+        <w:t xml:space="preserve">Derived from Project Plan v0.5 and checked against the current contract source and launch configuration. Equations identified as analytical models state their assumptions explicitly. The ordinary production path starts climbing from seniority notch 1; holders of verified on-chain Seniority Certificates may open positions via `stakeWithCertificate` carrying their permanent starting multiplier (corresponding to underlying `openWithHead`, with head start $\text{head} = \text{multiplier} - 1 \in [0, 21]$). This document contains no projected returns or promises of yield.</w:t>
       </w:r>
     </w:p>
     <w:p>
@@ -117,7 +117,7 @@
           <w:sz w:val="21"/>
           <w:color w:val="1F1F1F"/>
         </w:rPr>
-        <w:t xml:space="preserve"> of unreserved quote balance per interval, producing an idealized zero-inflow half-life of 4.735 days;</w:t>
+        <w:t xml:space="preserve"> of unreserved quote balance per interval, producing an idealized zero-inflow half-life of 4.736 days;</w:t>
       </w:r>
     </w:p>
     <w:p>
@@ -799,7 +799,7 @@
           <w:sz w:val="22"/>
           <w:color w:val="1C2422"/>
         </w:rPr>
-        <w:t xml:space="preserve">t_{1/2} = k_{1/2} \times 8 \text{ hours} \approx 113.65 \text{ hours} \approx 4.735 \text{ days}</w:t>
+        <w:t xml:space="preserve">t_{1/2} = k_{1/2} \times 8 \text{ hours} \approx 113.654 \text{ hours} \approx 4.736 \text{ days}</w:t>
       </w:r>
     </w:p>
     <w:p>
@@ -1690,7 +1690,7 @@
           <w:sz w:val="22"/>
           <w:color w:val="1C2422"/>
         </w:rPr>
-        <w:t xml:space="preserve">\text{Position}_i = \{ \text{owner}, \text{principal}, \text{diet}, \text{activeFrom}, \text{endInterval} \}</w:t>
+        <w:t xml:space="preserve">\text{Position}_i = \{ \text{owner}, \text{principal}, \text{diet}, \text{activeFrom}, \text{effectiveFrom}, \text{endInterval} \}</w:t>
       </w:r>
     </w:p>
     <w:p>
@@ -1756,7 +1756,7 @@
           <w:sz w:val="22"/>
           <w:color w:val="1F1F1F"/>
         </w:rPr>
-        <w:t xml:space="preserve"> and </w:t>
+        <w:t xml:space="preserve">, </w:t>
       </w:r>
       <w:r>
         <w:rPr>
@@ -1765,6 +1765,22 @@
           <w:color w:val="1C2422"/>
           <w:shd w:val="clear" w:color="auto" w:fill="F3F4F6"/>
         </w:rPr>
+        <w:t xml:space="preserve">effectiveFrom</w:t>
+      </w:r>
+      <w:r>
+        <w:rPr>
+          <w:sz w:val="22"/>
+          <w:color w:val="1F1F1F"/>
+        </w:rPr>
+        <w:t xml:space="preserve"> and </w:t>
+      </w:r>
+      <w:r>
+        <w:rPr>
+          <w:rFonts w:ascii="Menlo" w:hAnsi="Menlo"/>
+          <w:sz w:val="20"/>
+          <w:color w:val="1C2422"/>
+          <w:shd w:val="clear" w:color="auto" w:fill="F3F4F6"/>
+        </w:rPr>
         <w:t xml:space="preserve">endInterval</w:t>
       </w:r>
       <w:r>
@@ -1856,7 +1872,110 @@
           <w:sz w:val="21"/>
           <w:color w:val="1F1F1F"/>
         </w:rPr>
-        <w:t xml:space="preserve">, neutralizing flash-loan attacks seeking same-block staking and dividend extraction.</w:t>
+        <w:t xml:space="preserve">, neutralizing flash-loan attacks seeking same-block staking and dividend extraction;</w:t>
+      </w:r>
+    </w:p>
+    <w:p>
+      <w:pPr>
+        <w:pStyle w:val="ListBullet"/>
+      </w:pPr>
+      <w:r>
+        <w:rPr>
+          <w:color w:val="0F5C46"/>
+        </w:rPr>
+        <w:t xml:space="preserve">•  </w:t>
+      </w:r>
+      <w:r>
+        <w:rPr>
+          <w:b/>
+          <w:sz w:val="21"/>
+          <w:szCs w:val="21"/>
+          <w:color w:val="1F1F1F"/>
+        </w:rPr>
+        <w:t xml:space="preserve">Effective Activation Mapping</w:t>
+      </w:r>
+      <w:r>
+        <w:rPr>
+          <w:sz w:val="21"/>
+          <w:color w:val="1F1F1F"/>
+        </w:rPr>
+        <w:t xml:space="preserve">: For standard positions, </w:t>
+      </w:r>
+      <w:r>
+        <w:rPr>
+          <w:i/>
+          <w:sz w:val="21"/>
+          <w:color w:val="1C2422"/>
+        </w:rPr>
+        <w:t xml:space="preserve">\text{effectiveFrom} = \text{activeFrom}</w:t>
+      </w:r>
+      <w:r>
+        <w:rPr>
+          <w:sz w:val="21"/>
+          <w:color w:val="1F1F1F"/>
+        </w:rPr>
+        <w:t xml:space="preserve">; for positions opened with a Seniority Certificate (via </w:t>
+      </w:r>
+      <w:r>
+        <w:rPr>
+          <w:rFonts w:ascii="Menlo" w:hAnsi="Menlo"/>
+          <w:sz w:val="19"/>
+          <w:color w:val="1C2422"/>
+          <w:shd w:val="clear" w:color="auto" w:fill="F3F4F6"/>
+        </w:rPr>
+        <w:t xml:space="preserve">stakeWithCertificate</w:t>
+      </w:r>
+      <w:r>
+        <w:rPr>
+          <w:sz w:val="21"/>
+          <w:color w:val="1F1F1F"/>
+        </w:rPr>
+        <w:t xml:space="preserve">), let the certificate multiplier be </w:t>
+      </w:r>
+      <w:r>
+        <w:rPr>
+          <w:i/>
+          <w:sz w:val="21"/>
+          <w:color w:val="1C2422"/>
+        </w:rPr>
+        <w:t xml:space="preserve">\text{multiplier} \in [1, 22]</w:t>
+      </w:r>
+      <w:r>
+        <w:rPr>
+          <w:sz w:val="21"/>
+          <w:color w:val="1F1F1F"/>
+        </w:rPr>
+        <w:t xml:space="preserve">, yielding head-start </w:t>
+      </w:r>
+      <w:r>
+        <w:rPr>
+          <w:i/>
+          <w:sz w:val="21"/>
+          <w:color w:val="1C2422"/>
+        </w:rPr>
+        <w:t xml:space="preserve">\text{head} = \text{multiplier} - 1 \in [0, 21]</w:t>
+      </w:r>
+      <w:r>
+        <w:rPr>
+          <w:sz w:val="21"/>
+          <w:color w:val="1F1F1F"/>
+        </w:rPr>
+        <w:t xml:space="preserve">, and the contract records </w:t>
+      </w:r>
+      <w:r>
+        <w:rPr>
+          <w:i/>
+          <w:sz w:val="21"/>
+          <w:color w:val="1C2422"/>
+        </w:rPr>
+        <w:t xml:space="preserve">\text{effectiveFrom} = \text{activeFrom} - \text{head}</w:t>
+      </w:r>
+      <w:r>
+        <w:rPr>
+          <w:sz w:val="21"/>
+          <w:color w:val="1F1F1F"/>
+        </w:rPr>
+        <w:t xml:space="preserve">.</w:t>
       </w:r>
     </w:p>
     <w:p>
@@ -1911,7 +2030,67 @@
           <w:sz w:val="22"/>
           <w:color w:val="1F1F1F"/>
         </w:rPr>
-        <w:t xml:space="preserve">. The seniority multiplier initiates at 1, increments by 1 for each completed active protocol interval (whose minimum length is eight hours), and caps at 22 after 21 completed intervals:</w:t>
+        <w:t xml:space="preserve">. Prior to reaching the active interval (</w:t>
+      </w:r>
+      <w:r>
+        <w:rPr>
+          <w:i/>
+          <w:sz w:val="22"/>
+          <w:color w:val="1C2422"/>
+        </w:rPr>
+        <w:t xml:space="preserve">m &lt; \text{activeFrom}_i</w:t>
+      </w:r>
+      <w:r>
+        <w:rPr>
+          <w:sz w:val="22"/>
+          <w:color w:val="1F1F1F"/>
+        </w:rPr>
+        <w:t xml:space="preserve">), the seniority coefficient is strictly 0. Once active (</w:t>
+      </w:r>
+      <w:r>
+        <w:rPr>
+          <w:i/>
+          <w:sz w:val="22"/>
+          <w:color w:val="1C2422"/>
+        </w:rPr>
+        <w:t xml:space="preserve">m \ge \text{activeFrom}_i</w:t>
+      </w:r>
+      <w:r>
+        <w:rPr>
+          <w:sz w:val="22"/>
+          <w:color w:val="1F1F1F"/>
+        </w:rPr>
+        <w:t xml:space="preserve"> and </w:t>
+      </w:r>
+      <w:r>
+        <w:rPr>
+          <w:i/>
+          <w:sz w:val="22"/>
+          <w:color w:val="1C2422"/>
+        </w:rPr>
+        <w:t xml:space="preserve">m &lt; \text{endInterval}_i</w:t>
+      </w:r>
+      <w:r>
+        <w:rPr>
+          <w:sz w:val="22"/>
+          <w:color w:val="1F1F1F"/>
+        </w:rPr>
+        <w:t xml:space="preserve">), the coefficient is determined by the interval distance elapsed from its virtual activation interval </w:t>
+      </w:r>
+      <w:r>
+        <w:rPr>
+          <w:i/>
+          <w:sz w:val="22"/>
+          <w:color w:val="1C2422"/>
+        </w:rPr>
+        <w:t xml:space="preserve">\text{effectiveFrom}_i</w:t>
+      </w:r>
+      <w:r>
+        <w:rPr>
+          <w:sz w:val="22"/>
+          <w:color w:val="1F1F1F"/>
+        </w:rPr>
+        <w:t xml:space="preserve">, capping at 22:</w:t>
       </w:r>
     </w:p>
     <w:p>
@@ -1924,7 +2103,91 @@
           <w:sz w:val="22"/>
           <w:color w:val="1C2422"/>
         </w:rPr>
-        <w:t xml:space="preserve">c_i(m) = 1 + \min(m - j_i, 21), \quad \text{where } j_i = \text{activeFrom}_i \text{ and } m\ge j_i</w:t>
+        <w:t xml:space="preserve">c_i(m) = \begin{cases} 0, &amp; m &lt; \text{activeFrom}_i \\ 1 + \min(m - \text{effectiveFrom}_i, 21), &amp; m \ge \text{activeFrom}_i \text{ and } m &lt; \text{endInterval}_i \end{cases}</w:t>
+      </w:r>
+    </w:p>
+    <w:p>
+      <w:r>
+        <w:rPr>
+          <w:sz w:val="22"/>
+          <w:color w:val="1F1F1F"/>
+        </w:rPr>
+        <w:t xml:space="preserve">For standard positions (</w:t>
+      </w:r>
+      <w:r>
+        <w:rPr>
+          <w:i/>
+          <w:sz w:val="22"/>
+          <w:color w:val="1C2422"/>
+        </w:rPr>
+        <w:t xml:space="preserve">\text{effectiveFrom}_i = \text{activeFrom}_i</w:t>
+      </w:r>
+      <w:r>
+        <w:rPr>
+          <w:sz w:val="22"/>
+          <w:color w:val="1F1F1F"/>
+        </w:rPr>
+        <w:t xml:space="preserve">), the coefficient in the first active interval </w:t>
+      </w:r>
+      <w:r>
+        <w:rPr>
+          <w:i/>
+          <w:sz w:val="22"/>
+          <w:color w:val="1C2422"/>
+        </w:rPr>
+        <w:t xml:space="preserve">m = \text{activeFrom}_i</w:t>
+      </w:r>
+      <w:r>
+        <w:rPr>
+          <w:sz w:val="22"/>
+          <w:color w:val="1F1F1F"/>
+        </w:rPr>
+        <w:t xml:space="preserve"> is </w:t>
+      </w:r>
+      <w:r>
+        <w:rPr>
+          <w:i/>
+          <w:sz w:val="22"/>
+          <w:color w:val="1C2422"/>
+        </w:rPr>
+        <w:t xml:space="preserve">1 + 0 = 1</w:t>
+      </w:r>
+      <w:r>
+        <w:rPr>
+          <w:sz w:val="22"/>
+          <w:color w:val="1F1F1F"/>
+        </w:rPr>
+        <w:t xml:space="preserve">. For positions staked with a maximum certificate (</w:t>
+      </w:r>
+      <w:r>
+        <w:rPr>
+          <w:i/>
+          <w:sz w:val="22"/>
+          <w:color w:val="1C2422"/>
+        </w:rPr>
+        <w:t xml:space="preserve">\text{head}_i = 21</w:t>
+      </w:r>
+      <w:r>
+        <w:rPr>
+          <w:sz w:val="22"/>
+          <w:color w:val="1F1F1F"/>
+        </w:rPr>
+        <w:t xml:space="preserve">), the coefficient in the first active interval immediately achieves </w:t>
+      </w:r>
+      <w:r>
+        <w:rPr>
+          <w:i/>
+          <w:sz w:val="22"/>
+          <w:color w:val="1C2422"/>
+        </w:rPr>
+        <w:t xml:space="preserve">1 + 21 = 22</w:t>
+      </w:r>
+      <w:r>
+        <w:rPr>
+          <w:sz w:val="22"/>
+          <w:color w:val="1F1F1F"/>
+        </w:rPr>
+        <w:t xml:space="preserve">.</w:t>
       </w:r>
     </w:p>
     <w:p>
@@ -1971,7 +2234,7 @@
         <w:pStyle w:val="Heading3"/>
       </w:pPr>
       <w:r>
-        <w:t>Algebraic Closed-Form Decomposition</w:t>
+        <w:t>Algebraic Closed-Form Decomposition &amp; Opening Correction</w:t>
       </w:r>
     </w:p>
     <w:p>
@@ -1995,7 +2258,22 @@
           <w:sz w:val="22"/>
           <w:color w:val="1F1F1F"/>
         </w:rPr>
-        <w:t xml:space="preserve"> by decomposing the active staking population into two mutually exclusive sets:</w:t>
+        <w:t xml:space="preserve"> by decomposing active positions into two mutually exclusive sets based on their distance from </w:t>
+      </w:r>
+      <w:r>
+        <w:rPr>
+          <w:i/>
+          <w:sz w:val="22"/>
+          <w:color w:val="1C2422"/>
+        </w:rPr>
+        <w:t xml:space="preserve">\text{effectiveFrom}</w:t>
+      </w:r>
+      <w:r>
+        <w:rPr>
+          <w:sz w:val="22"/>
+          <w:color w:val="1F1F1F"/>
+        </w:rPr>
+        <w:t xml:space="preserve">:</w:t>
       </w:r>
     </w:p>
     <w:p>
@@ -2031,22 +2309,7 @@
           <w:sz w:val="21"/>
           <w:color w:val="1C2422"/>
         </w:rPr>
-        <w:t xml:space="preserve">m - j_i &lt; 21</w:t>
-      </w:r>
-      <w:r>
-        <w:rPr>
-          <w:sz w:val="21"/>
-          <w:color w:val="1F1F1F"/>
-        </w:rPr>
-        <w:t xml:space="preserve">, yielding </w:t>
-      </w:r>
-      <w:r>
-        <w:rPr>
-          <w:i/>
-          <w:sz w:val="21"/>
-          <w:color w:val="1C2422"/>
-        </w:rPr>
-        <w:t xml:space="preserve">c_i(m) = 1 + m - j_i</w:t>
+        <w:t xml:space="preserve">m - \text{effectiveFrom}_i &lt; 21</w:t>
       </w:r>
       <w:r>
         <w:rPr>
@@ -2089,26 +2352,381 @@
           <w:sz w:val="21"/>
           <w:color w:val="1C2422"/>
         </w:rPr>
-        <w:t xml:space="preserve">m - j_i \ge 21</w:t>
-      </w:r>
-      <w:r>
-        <w:rPr>
-          <w:sz w:val="21"/>
-          <w:color w:val="1F1F1F"/>
-        </w:rPr>
-        <w:t xml:space="preserve">, yielding </w:t>
-      </w:r>
-      <w:r>
-        <w:rPr>
-          <w:i/>
-          <w:sz w:val="21"/>
-          <w:color w:val="1C2422"/>
-        </w:rPr>
-        <w:t xml:space="preserve">c_i(m) = 22</w:t>
-      </w:r>
-      <w:r>
-        <w:rPr>
-          <w:sz w:val="21"/>
+        <w:t xml:space="preserve">m - \text{effectiveFrom}_i \ge 21</w:t>
+      </w:r>
+      <w:r>
+        <w:rPr>
+          <w:sz w:val="21"/>
+          <w:color w:val="1F1F1F"/>
+        </w:rPr>
+        <w:t xml:space="preserve">, yielding capped coefficient 22.</w:t>
+      </w:r>
+    </w:p>
+    <w:p>
+      <w:r>
+        <w:rPr>
+          <w:sz w:val="22"/>
+          <w:color w:val="1F1F1F"/>
+        </w:rPr>
+        <w:t xml:space="preserve">Summing over the climbing set:</w:t>
+      </w:r>
+    </w:p>
+    <w:p>
+      <w:pPr>
+        <w:pStyle w:val="Equation"/>
+      </w:pPr>
+      <w:r>
+        <w:rPr>
+          <w:i/>
+          <w:sz w:val="22"/>
+          <w:color w:val="1C2422"/>
+        </w:rPr>
+        <w:t xml:space="preserve">\sum_{i \in \text{Climb}} p_i \cdot (1 + m - \text{effectiveFrom}_i) = (1 + m) \sum_{i \in \text{Climb}} p_i - \sum_{i \in \text{Climb}} (p_i \cdot \text{effectiveFrom}_i)</w:t>
+      </w:r>
+    </w:p>
+    <w:p>
+      <w:r>
+        <w:rPr>
+          <w:sz w:val="22"/>
+          <w:color w:val="1F1F1F"/>
+        </w:rPr>
+        <w:t xml:space="preserve">The smart contract maintains four global scalar storage accumulators:</w:t>
+      </w:r>
+    </w:p>
+    <w:p>
+      <w:pPr>
+        <w:pStyle w:val="ListBullet"/>
+      </w:pPr>
+      <w:r>
+        <w:rPr>
+          <w:color w:val="0F5C46"/>
+        </w:rPr>
+        <w:t xml:space="preserve">•  </w:t>
+      </w:r>
+      <w:r>
+        <w:rPr>
+          <w:sz w:val="21"/>
+          <w:color w:val="1F1F1F"/>
+        </w:rPr>
+        <w:t xml:space="preserve"/>
+      </w:r>
+      <w:r>
+        <w:rPr>
+          <w:i/>
+          <w:sz w:val="21"/>
+          <w:color w:val="1C2422"/>
+        </w:rPr>
+        <w:t xml:space="preserve">P_{\text{climb}} = \sum_{i \in \text{Climb}} p_i</w:t>
+      </w:r>
+      <w:r>
+        <w:rPr>
+          <w:sz w:val="21"/>
+          <w:color w:val="1F1F1F"/>
+        </w:rPr>
+        <w:t xml:space="preserve"> (Aggregate principal of climbing cohorts)</w:t>
+      </w:r>
+    </w:p>
+    <w:p>
+      <w:pPr>
+        <w:pStyle w:val="ListBullet"/>
+      </w:pPr>
+      <w:r>
+        <w:rPr>
+          <w:color w:val="0F5C46"/>
+        </w:rPr>
+        <w:t xml:space="preserve">•  </w:t>
+      </w:r>
+      <w:r>
+        <w:rPr>
+          <w:sz w:val="21"/>
+          <w:color w:val="1F1F1F"/>
+        </w:rPr>
+        <w:t xml:space="preserve"/>
+      </w:r>
+      <w:r>
+        <w:rPr>
+          <w:i/>
+          <w:sz w:val="21"/>
+          <w:color w:val="1C2422"/>
+        </w:rPr>
+        <w:t xml:space="preserve">J_{\text{climb}} = \sum_{i \in \text{Climb}} (p_i \cdot \text{effectiveFrom}_i)</w:t>
+      </w:r>
+      <w:r>
+        <w:rPr>
+          <w:sz w:val="21"/>
+          <w:color w:val="1F1F1F"/>
+        </w:rPr>
+        <w:t xml:space="preserve"> (Aggregate weighted virtual activation scalar)</w:t>
+      </w:r>
+    </w:p>
+    <w:p>
+      <w:pPr>
+        <w:pStyle w:val="ListBullet"/>
+      </w:pPr>
+      <w:r>
+        <w:rPr>
+          <w:color w:val="0F5C46"/>
+        </w:rPr>
+        <w:t xml:space="preserve">•  </w:t>
+      </w:r>
+      <w:r>
+        <w:rPr>
+          <w:sz w:val="21"/>
+          <w:color w:val="1F1F1F"/>
+        </w:rPr>
+        <w:t xml:space="preserve"/>
+      </w:r>
+      <w:r>
+        <w:rPr>
+          <w:i/>
+          <w:sz w:val="21"/>
+          <w:color w:val="1C2422"/>
+        </w:rPr>
+        <w:t xml:space="preserve">P_{\text{settled}} = \sum_{i \in \text{Settled}} p_i</w:t>
+      </w:r>
+      <w:r>
+        <w:rPr>
+          <w:sz w:val="21"/>
+          <w:color w:val="1F1F1F"/>
+        </w:rPr>
+        <w:t xml:space="preserve"> (Aggregate principal of settled cohorts)</w:t>
+      </w:r>
+    </w:p>
+    <w:p>
+      <w:pPr>
+        <w:pStyle w:val="ListBullet"/>
+      </w:pPr>
+      <w:r>
+        <w:rPr>
+          <w:color w:val="0F5C46"/>
+        </w:rPr>
+        <w:t xml:space="preserve">•  </w:t>
+      </w:r>
+      <w:r>
+        <w:rPr>
+          <w:sz w:val="21"/>
+          <w:color w:val="1F1F1F"/>
+        </w:rPr>
+        <w:t xml:space="preserve"/>
+      </w:r>
+      <w:r>
+        <w:rPr>
+          <w:i/>
+          <w:sz w:val="21"/>
+          <w:color w:val="1C2422"/>
+        </w:rPr>
+        <w:t xml:space="preserve">\text{headOpening} = \sum_{i \in \text{Opening}} (\text{head}_i \cdot p_i)</w:t>
+      </w:r>
+      <w:r>
+        <w:rPr>
+          <w:sz w:val="21"/>
+          <w:color w:val="1F1F1F"/>
+        </w:rPr>
+        <w:t xml:space="preserve"> (Transient opening-interval certificate head weight)</w:t>
+      </w:r>
+    </w:p>
+    <w:p>
+      <w:r>
+        <w:rPr>
+          <w:b/>
+          <w:sz w:val="22"/>
+          <w:szCs w:val="22"/>
+          <w:color w:val="1F1F1F"/>
+        </w:rPr>
+        <w:t xml:space="preserve">Opening Interval Correction (`headOpening`)</w:t>
+      </w:r>
+      <w:r>
+        <w:rPr>
+          <w:sz w:val="22"/>
+          <w:color w:val="1F1F1F"/>
+        </w:rPr>
+        <w:t xml:space="preserve">:</w:t>
+      </w:r>
+    </w:p>
+    <w:p>
+      <w:r>
+        <w:rPr>
+          <w:sz w:val="22"/>
+          <w:color w:val="1F1F1F"/>
+        </w:rPr>
+        <w:t xml:space="preserve">When a standard position is opened in interval </w:t>
+      </w:r>
+      <w:r>
+        <w:rPr>
+          <w:i/>
+          <w:sz w:val="22"/>
+          <w:color w:val="1C2422"/>
+        </w:rPr>
+        <w:t xml:space="preserve">m</w:t>
+      </w:r>
+      <w:r>
+        <w:rPr>
+          <w:sz w:val="22"/>
+          <w:color w:val="1F1F1F"/>
+        </w:rPr>
+        <w:t xml:space="preserve">, </w:t>
+      </w:r>
+      <w:r>
+        <w:rPr>
+          <w:i/>
+          <w:sz w:val="22"/>
+          <w:color w:val="1C2422"/>
+        </w:rPr>
+        <w:t xml:space="preserve">\text{activeFrom} = \text{effectiveFrom} = m + 1</w:t>
+      </w:r>
+      <w:r>
+        <w:rPr>
+          <w:sz w:val="22"/>
+          <w:color w:val="1F1F1F"/>
+        </w:rPr>
+        <w:t xml:space="preserve">, so its algebraic contribution in </w:t>
+      </w:r>
+      <w:r>
+        <w:rPr>
+          <w:i/>
+          <w:sz w:val="22"/>
+          <w:color w:val="1C2422"/>
+        </w:rPr>
+        <w:t xml:space="preserve">(1 + m)P_{\text{climb}} - J_{\text{climb}}</w:t>
+      </w:r>
+      <w:r>
+        <w:rPr>
+          <w:sz w:val="22"/>
+          <w:color w:val="1F1F1F"/>
+        </w:rPr>
+        <w:t xml:space="preserve"> is </w:t>
+      </w:r>
+      <w:r>
+        <w:rPr>
+          <w:i/>
+          <w:sz w:val="22"/>
+          <w:color w:val="1C2422"/>
+        </w:rPr>
+        <w:t xml:space="preserve">(1 + m - (m + 1)) \cdot p = 0</w:t>
+      </w:r>
+      <w:r>
+        <w:rPr>
+          <w:sz w:val="22"/>
+          <w:color w:val="1F1F1F"/>
+        </w:rPr>
+        <w:t xml:space="preserve">. However, for a certificate position, </w:t>
+      </w:r>
+      <w:r>
+        <w:rPr>
+          <w:i/>
+          <w:sz w:val="22"/>
+          <w:color w:val="1C2422"/>
+        </w:rPr>
+        <w:t xml:space="preserve">\text{effectiveFrom} = m + 1 - \text{head}</w:t>
+      </w:r>
+      <w:r>
+        <w:rPr>
+          <w:sz w:val="22"/>
+          <w:color w:val="1F1F1F"/>
+        </w:rPr>
+        <w:t xml:space="preserve">, expanding to </w:t>
+      </w:r>
+      <w:r>
+        <w:rPr>
+          <w:i/>
+          <w:sz w:val="22"/>
+          <w:color w:val="1C2422"/>
+        </w:rPr>
+        <w:t xml:space="preserve">(1 + m - (m + 1 - \text{head})) \cdot p = \text{head} \cdot p</w:t>
+      </w:r>
+      <w:r>
+        <w:rPr>
+          <w:sz w:val="22"/>
+          <w:color w:val="1F1F1F"/>
+        </w:rPr>
+        <w:t xml:space="preserve">. To prevent positions with head-starts from receiving unearned rewards in their opening interval </w:t>
+      </w:r>
+      <w:r>
+        <w:rPr>
+          <w:i/>
+          <w:sz w:val="22"/>
+          <w:color w:val="1C2422"/>
+        </w:rPr>
+        <w:t xml:space="preserve">m</w:t>
+      </w:r>
+      <w:r>
+        <w:rPr>
+          <w:sz w:val="22"/>
+          <w:color w:val="1F1F1F"/>
+        </w:rPr>
+        <w:t xml:space="preserve"> prior to activation, the ledger records </w:t>
+      </w:r>
+      <w:r>
+        <w:rPr>
+          <w:i/>
+          <w:sz w:val="22"/>
+          <w:color w:val="1C2422"/>
+        </w:rPr>
+        <w:t xml:space="preserve">\text{head} \cdot p</w:t>
+      </w:r>
+      <w:r>
+        <w:rPr>
+          <w:sz w:val="22"/>
+          <w:color w:val="1F1F1F"/>
+        </w:rPr>
+        <w:t xml:space="preserve"> into </w:t>
+      </w:r>
+      <w:r>
+        <w:rPr>
+          <w:i/>
+          <w:sz w:val="22"/>
+          <w:color w:val="1C2422"/>
+        </w:rPr>
+        <w:t xml:space="preserve">\text{headOpening}</w:t>
+      </w:r>
+      <w:r>
+        <w:rPr>
+          <w:sz w:val="22"/>
+          <w:color w:val="1F1F1F"/>
+        </w:rPr>
+        <w:t xml:space="preserve"> upon creation and subtracts it atomically from total weight. When the clock advances to </w:t>
+      </w:r>
+      <w:r>
+        <w:rPr>
+          <w:i/>
+          <w:sz w:val="22"/>
+          <w:color w:val="1C2422"/>
+        </w:rPr>
+        <w:t xml:space="preserve">m+1</w:t>
+      </w:r>
+      <w:r>
+        <w:rPr>
+          <w:sz w:val="22"/>
+          <w:color w:val="1F1F1F"/>
+        </w:rPr>
+        <w:t xml:space="preserve">, </w:t>
+      </w:r>
+      <w:r>
+        <w:rPr>
+          <w:i/>
+          <w:sz w:val="22"/>
+          <w:color w:val="1C2422"/>
+        </w:rPr>
+        <w:t xml:space="preserve">\text{headOpening}</w:t>
+      </w:r>
+      <w:r>
+        <w:rPr>
+          <w:sz w:val="22"/>
+          <w:color w:val="1F1F1F"/>
+        </w:rPr>
+        <w:t xml:space="preserve"> is automatically reset to zero, allowing the position to contribute its full initial weight starting in </w:t>
+      </w:r>
+      <w:r>
+        <w:rPr>
+          <w:i/>
+          <w:sz w:val="22"/>
+          <w:color w:val="1C2422"/>
+        </w:rPr>
+        <w:t xml:space="preserve">m+1</w:t>
+      </w:r>
+      <w:r>
+        <w:rPr>
+          <w:sz w:val="22"/>
           <w:color w:val="1F1F1F"/>
         </w:rPr>
         <w:t xml:space="preserve">.</w:t>
@@ -2120,7 +2738,38 @@
           <w:sz w:val="22"/>
           <w:color w:val="1F1F1F"/>
         </w:rPr>
-        <w:t xml:space="preserve">Summing over the climbing set:</w:t>
+        <w:t xml:space="preserve">At any arbitrary interval </w:t>
+      </w:r>
+      <w:r>
+        <w:rPr>
+          <w:i/>
+          <w:sz w:val="22"/>
+          <w:color w:val="1C2422"/>
+        </w:rPr>
+        <w:t xml:space="preserve">m</w:t>
+      </w:r>
+      <w:r>
+        <w:rPr>
+          <w:sz w:val="22"/>
+          <w:color w:val="1F1F1F"/>
+        </w:rPr>
+        <w:t xml:space="preserve">, total protocol weight reduces to an </w:t>
+      </w:r>
+      <w:r>
+        <w:rPr>
+          <w:b/>
+          <w:sz w:val="22"/>
+          <w:szCs w:val="22"/>
+          <w:color w:val="1F1F1F"/>
+        </w:rPr>
+        <w:t xml:space="preserve">$O(1)$ constant-time scalar arithmetic evaluation</w:t>
+      </w:r>
+      <w:r>
+        <w:rPr>
+          <w:sz w:val="22"/>
+          <w:color w:val="1F1F1F"/>
+        </w:rPr>
+        <w:t xml:space="preserve">:</w:t>
       </w:r>
     </w:p>
     <w:p>
@@ -2133,91 +2782,24 @@
           <w:sz w:val="22"/>
           <w:color w:val="1C2422"/>
         </w:rPr>
-        <w:t xml:space="preserve">\sum_{i \in \text{Climb}} p_i \cdot (1 + m - j_i) = (1 + m) \sum_{i \in \text{Climb}} p_i - \sum_{i \in \text{Climb}} (p_i \cdot j_i)</w:t>
-      </w:r>
-    </w:p>
-    <w:p>
-      <w:r>
-        <w:rPr>
-          <w:sz w:val="22"/>
-          <w:color w:val="1F1F1F"/>
-        </w:rPr>
-        <w:t xml:space="preserve">The smart contract maintains two global scalar storage accumulators:</w:t>
-      </w:r>
-    </w:p>
-    <w:p>
-      <w:pPr>
-        <w:pStyle w:val="ListBullet"/>
-      </w:pPr>
-      <w:r>
-        <w:rPr>
-          <w:color w:val="0F5C46"/>
-        </w:rPr>
-        <w:t xml:space="preserve">•  </w:t>
-      </w:r>
-      <w:r>
-        <w:rPr>
-          <w:sz w:val="21"/>
-          <w:color w:val="1F1F1F"/>
-        </w:rPr>
-        <w:t xml:space="preserve"/>
-      </w:r>
-      <w:r>
-        <w:rPr>
-          <w:i/>
-          <w:sz w:val="21"/>
-          <w:color w:val="1C2422"/>
-        </w:rPr>
-        <w:t xml:space="preserve">P_{\text{climb}} = \sum_{i \in \text{Climb}} p_i</w:t>
-      </w:r>
-      <w:r>
-        <w:rPr>
-          <w:sz w:val="21"/>
-          <w:color w:val="1F1F1F"/>
-        </w:rPr>
-        <w:t xml:space="preserve"> (Aggregate principal of climbing cohorts)</w:t>
-      </w:r>
-    </w:p>
-    <w:p>
-      <w:pPr>
-        <w:pStyle w:val="ListBullet"/>
-      </w:pPr>
-      <w:r>
-        <w:rPr>
-          <w:color w:val="0F5C46"/>
-        </w:rPr>
-        <w:t xml:space="preserve">•  </w:t>
-      </w:r>
-      <w:r>
-        <w:rPr>
-          <w:sz w:val="21"/>
-          <w:color w:val="1F1F1F"/>
-        </w:rPr>
-        <w:t xml:space="preserve"/>
-      </w:r>
-      <w:r>
-        <w:rPr>
-          <w:i/>
-          <w:sz w:val="21"/>
-          <w:color w:val="1C2422"/>
-        </w:rPr>
-        <w:t xml:space="preserve">J_{\text{climb}} = \sum_{i \in \text{Climb}} (p_i \cdot j_i)</w:t>
-      </w:r>
-      <w:r>
-        <w:rPr>
-          <w:sz w:val="21"/>
-          <w:color w:val="1F1F1F"/>
-        </w:rPr>
-        <w:t xml:space="preserve"> (Aggregate weighted activation scalar)</w:t>
-      </w:r>
-    </w:p>
-    <w:p>
-      <w:r>
-        <w:rPr>
-          <w:sz w:val="22"/>
-          <w:color w:val="1F1F1F"/>
-        </w:rPr>
-        <w:t xml:space="preserve">At any arbitrary interval </w:t>
+        <w:t xml:space="preserve">W(m) = (1 + m) \cdot P_{\text{climb}} - J_{\text{climb}} + 22 \cdot P_{\text{settled}} + W_{\text{exiting}} - \text{headOpening}</w:t>
+      </w:r>
+    </w:p>
+    <w:p>
+      <w:pPr>
+        <w:pStyle w:val="Heading3"/>
+      </w:pPr>
+      <w:r>
+        <w:t>22-Cohort Circular Graduation Buffer (Graduation Ring)</w:t>
+      </w:r>
+    </w:p>
+    <w:p>
+      <w:r>
+        <w:rPr>
+          <w:sz w:val="22"/>
+          <w:color w:val="1F1F1F"/>
+        </w:rPr>
+        <w:t xml:space="preserve">As interval </w:t>
       </w:r>
       <w:r>
         <w:rPr>
@@ -2232,16 +2814,45 @@
           <w:sz w:val="22"/>
           <w:color w:val="1F1F1F"/>
         </w:rPr>
-        <w:t xml:space="preserve">, total protocol weight reduces to an </w:t>
-      </w:r>
-      <w:r>
-        <w:rPr>
-          <w:b/>
-          <w:sz w:val="22"/>
-          <w:szCs w:val="22"/>
-          <w:color w:val="1F1F1F"/>
-        </w:rPr>
-        <w:t xml:space="preserve">$O(1)$ constant-time scalar arithmetic evaluation</w:t>
+        <w:t xml:space="preserve"> elapses, cohorts completing their 21st interval graduate from </w:t>
+      </w:r>
+      <w:r>
+        <w:rPr>
+          <w:i/>
+          <w:sz w:val="22"/>
+          <w:color w:val="1C2422"/>
+        </w:rPr>
+        <w:t xml:space="preserve">P_{\text{climb}}</w:t>
+      </w:r>
+      <w:r>
+        <w:rPr>
+          <w:sz w:val="22"/>
+          <w:color w:val="1F1F1F"/>
+        </w:rPr>
+        <w:t xml:space="preserve"> into </w:t>
+      </w:r>
+      <w:r>
+        <w:rPr>
+          <w:i/>
+          <w:sz w:val="22"/>
+          <w:color w:val="1C2422"/>
+        </w:rPr>
+        <w:t xml:space="preserve">P_{\text{settled}}</w:t>
+      </w:r>
+      <w:r>
+        <w:rPr>
+          <w:sz w:val="22"/>
+          <w:color w:val="1F1F1F"/>
+        </w:rPr>
+        <w:t xml:space="preserve">. The contract manages this transition via a fixed circular array of size </w:t>
+      </w:r>
+      <w:r>
+        <w:rPr>
+          <w:i/>
+          <w:sz w:val="22"/>
+          <w:color w:val="1C2422"/>
+        </w:rPr>
+        <w:t xml:space="preserve">\text{COHORT\_SLOTS} = 22</w:t>
       </w:r>
       <w:r>
         <w:rPr>
@@ -2261,97 +2872,7 @@
           <w:sz w:val="22"/>
           <w:color w:val="1C2422"/>
         </w:rPr>
-        <w:t xml:space="preserve">W(m) = (1 + m) \cdot P_{\text{climb}} - J_{\text{climb}} + 22 \cdot P_{\text{settled}} + W_{\text{exiting}}</w:t>
-      </w:r>
-    </w:p>
-    <w:p>
-      <w:pPr>
-        <w:pStyle w:val="Heading3"/>
-      </w:pPr>
-      <w:r>
-        <w:t>22-Cohort Circular Graduation Buffer (Graduation Ring)</w:t>
-      </w:r>
-    </w:p>
-    <w:p>
-      <w:r>
-        <w:rPr>
-          <w:sz w:val="22"/>
-          <w:color w:val="1F1F1F"/>
-        </w:rPr>
-        <w:t xml:space="preserve">As interval </w:t>
-      </w:r>
-      <w:r>
-        <w:rPr>
-          <w:i/>
-          <w:sz w:val="22"/>
-          <w:color w:val="1C2422"/>
-        </w:rPr>
-        <w:t xml:space="preserve">m</w:t>
-      </w:r>
-      <w:r>
-        <w:rPr>
-          <w:sz w:val="22"/>
-          <w:color w:val="1F1F1F"/>
-        </w:rPr>
-        <w:t xml:space="preserve"> elapses, cohorts completing their 21st interval graduate from </w:t>
-      </w:r>
-      <w:r>
-        <w:rPr>
-          <w:i/>
-          <w:sz w:val="22"/>
-          <w:color w:val="1C2422"/>
-        </w:rPr>
-        <w:t xml:space="preserve">P_{\text{climb}}</w:t>
-      </w:r>
-      <w:r>
-        <w:rPr>
-          <w:sz w:val="22"/>
-          <w:color w:val="1F1F1F"/>
-        </w:rPr>
-        <w:t xml:space="preserve"> into </w:t>
-      </w:r>
-      <w:r>
-        <w:rPr>
-          <w:i/>
-          <w:sz w:val="22"/>
-          <w:color w:val="1C2422"/>
-        </w:rPr>
-        <w:t xml:space="preserve">P_{\text{settled}}</w:t>
-      </w:r>
-      <w:r>
-        <w:rPr>
-          <w:sz w:val="22"/>
-          <w:color w:val="1F1F1F"/>
-        </w:rPr>
-        <w:t xml:space="preserve">. The contract manages this transition via a fixed circular array of size </w:t>
-      </w:r>
-      <w:r>
-        <w:rPr>
-          <w:i/>
-          <w:sz w:val="22"/>
-          <w:color w:val="1C2422"/>
-        </w:rPr>
-        <w:t xml:space="preserve">\text{COHORT\_SLOTS} = 22</w:t>
-      </w:r>
-      <w:r>
-        <w:rPr>
-          <w:sz w:val="22"/>
-          <w:color w:val="1F1F1F"/>
-        </w:rPr>
-        <w:t xml:space="preserve">:</w:t>
-      </w:r>
-    </w:p>
-    <w:p>
-      <w:pPr>
-        <w:pStyle w:val="Equation"/>
-      </w:pPr>
-      <w:r>
-        <w:rPr>
-          <w:i/>
-          <w:sz w:val="22"/>
-          <w:color w:val="1C2422"/>
-        </w:rPr>
-        <w:t xml:space="preserve">\text{slot} = \text{activeFrom} \pmod{22}</w:t>
+        <w:t xml:space="preserve">\text{slot} = \text{effectiveFrom} \pmod{22}</w:t>
       </w:r>
     </w:p>
     <w:p>
@@ -3815,34 +4336,22 @@
           <w:sz w:val="21"/>
           <w:color w:val="1F1F1F"/>
         </w:rPr>
-        <w:t xml:space="preserve">: Deployed alongside the core staking contracts; stakers exiting an active position may choose to imprint their accrued seniority notch (up to 22) into an immutable ERC-721 credential token;</w:t>
-      </w:r>
-    </w:p>
-    <w:p>
-      <w:pPr>
-        <w:pStyle w:val="ListBullet"/>
-      </w:pPr>
-      <w:r>
-        <w:rPr>
-          <w:color w:val="0F5C46"/>
-        </w:rPr>
-        <w:t xml:space="preserve">•  </w:t>
-      </w:r>
-      <w:r>
-        <w:rPr>
-          <w:b/>
-          <w:sz w:val="21"/>
-          <w:szCs w:val="21"/>
-          <w:color w:val="1F1F1F"/>
-        </w:rPr>
-        <w:t xml:space="preserve">Deflationary Burn Sink</w:t>
-      </w:r>
-      <w:r>
-        <w:rPr>
-          <w:sz w:val="21"/>
-          <w:color w:val="1F1F1F"/>
-        </w:rPr>
-        <w:t xml:space="preserve">: Minting permanently burns </w:t>
+        <w:t xml:space="preserve">: Deployed alongside the core staking contracts. When fully exiting an active standard position, as long as principal satisfies </w:t>
+      </w:r>
+      <w:r>
+        <w:rPr>
+          <w:i/>
+          <w:sz w:val="21"/>
+          <w:color w:val="1C2422"/>
+        </w:rPr>
+        <w:t xml:space="preserve">\ge 100{,}000\text{ FATCAT}</w:t>
+      </w:r>
+      <w:r>
+        <w:rPr>
+          <w:sz w:val="21"/>
+          <w:color w:val="1F1F1F"/>
+        </w:rPr>
+        <w:t xml:space="preserve"> and the contract has been deployed for at least 21 days (</w:t>
       </w:r>
       <w:r>
         <w:rPr>
@@ -3851,14 +4360,14 @@
           <w:color w:val="1C2422"/>
           <w:shd w:val="clear" w:color="auto" w:fill="F3F4F6"/>
         </w:rPr>
-        <w:t xml:space="preserve">100_000 FATCAT</w:t>
-      </w:r>
-      <w:r>
-        <w:rPr>
-          <w:sz w:val="21"/>
-          <w:color w:val="1F1F1F"/>
-        </w:rPr>
-        <w:t xml:space="preserve"> directly to the blackhole dead address </w:t>
+        <w:t xml:space="preserve">mintOpensAt</w:t>
+      </w:r>
+      <w:r>
+        <w:rPr>
+          <w:sz w:val="21"/>
+          <w:color w:val="1F1F1F"/>
+        </w:rPr>
+        <w:t xml:space="preserve"> unlocked), stakers may call </w:t>
       </w:r>
       <w:r>
         <w:rPr>
@@ -3867,14 +4376,29 @@
           <w:color w:val="1C2422"/>
           <w:shd w:val="clear" w:color="auto" w:fill="F3F4F6"/>
         </w:rPr>
-        <w:t xml:space="preserve">0x000000000000000000000000000000000000dEaD</w:t>
-      </w:r>
-      <w:r>
-        <w:rPr>
-          <w:sz w:val="21"/>
-          <w:color w:val="1F1F1F"/>
-        </w:rPr>
-        <w:t xml:space="preserve">, coupling credential issuance to protocol deflation;</w:t>
+        <w:t xml:space="preserve">redeemAndIssueCertificate()</w:t>
+      </w:r>
+      <w:r>
+        <w:rPr>
+          <w:sz w:val="21"/>
+          <w:color w:val="1F1F1F"/>
+        </w:rPr>
+        <w:t xml:space="preserve"> to imprint their accrued seniority notch (</w:t>
+      </w:r>
+      <w:r>
+        <w:rPr>
+          <w:i/>
+          <w:sz w:val="21"/>
+          <w:color w:val="1C2422"/>
+        </w:rPr>
+        <w:t xml:space="preserve">c_i \in [1, 22]</w:t>
+      </w:r>
+      <w:r>
+        <w:rPr>
+          <w:sz w:val="21"/>
+          <w:color w:val="1F1F1F"/>
+        </w:rPr>
+        <w:t xml:space="preserve">) into an immutable ERC-721 credential token (available across all notches, not restricted to notch 22);</w:t>
       </w:r>
     </w:p>
     <w:p>
@@ -3894,14 +4418,14 @@
           <w:szCs w:val="21"/>
           <w:color w:val="1F1F1F"/>
         </w:rPr>
-        <w:t xml:space="preserve">Fixed Hard Cap &amp; Cold-Start Lock</w:t>
-      </w:r>
-      <w:r>
-        <w:rPr>
-          <w:sz w:val="21"/>
-          <w:color w:val="1F1F1F"/>
-        </w:rPr>
-        <w:t xml:space="preserve">: Capped at 10,000 tokens; minting opens once 21 days after deployment (</w:t>
+        <w:t xml:space="preserve">Permanent Dead Address Lock</w:t>
+      </w:r>
+      <w:r>
+        <w:rPr>
+          <w:sz w:val="21"/>
+          <w:color w:val="1F1F1F"/>
+        </w:rPr>
+        <w:t xml:space="preserve">: Minting permanently transfers the fixed </w:t>
       </w:r>
       <w:r>
         <w:rPr>
@@ -3910,41 +4434,14 @@
           <w:color w:val="1C2422"/>
           <w:shd w:val="clear" w:color="auto" w:fill="F3F4F6"/>
         </w:rPr>
-        <w:t xml:space="preserve">mintOpensAt = deploy + MINT_DELAY</w:t>
-      </w:r>
-      <w:r>
-        <w:rPr>
-          <w:sz w:val="21"/>
-          <w:color w:val="1F1F1F"/>
-        </w:rPr>
-        <w:t xml:space="preserve">); no per-mint cooldown;</w:t>
-      </w:r>
-    </w:p>
-    <w:p>
-      <w:pPr>
-        <w:pStyle w:val="ListBullet"/>
-      </w:pPr>
-      <w:r>
-        <w:rPr>
-          <w:color w:val="0F5C46"/>
-        </w:rPr>
-        <w:t xml:space="preserve">•  </w:t>
-      </w:r>
-      <w:r>
-        <w:rPr>
-          <w:b/>
-          <w:sz w:val="21"/>
-          <w:szCs w:val="21"/>
-          <w:color w:val="1F1F1F"/>
-        </w:rPr>
-        <w:t xml:space="preserve">100% On-Chain SVG Rendering</w:t>
-      </w:r>
-      <w:r>
-        <w:rPr>
-          <w:sz w:val="21"/>
-          <w:color w:val="1F1F1F"/>
-        </w:rPr>
-        <w:t xml:space="preserve">: Dynamic artwork and metadata are computed and rendered purely on-chain as vector SVGs by </w:t>
+        <w:t xml:space="preserve">100_000 FATCAT</w:t>
+      </w:r>
+      <w:r>
+        <w:rPr>
+          <w:sz w:val="21"/>
+          <w:color w:val="1F1F1F"/>
+        </w:rPr>
+        <w:t xml:space="preserve"> (</w:t>
       </w:r>
       <w:r>
         <w:rPr>
@@ -3953,14 +4450,14 @@
           <w:color w:val="1C2422"/>
           <w:shd w:val="clear" w:color="auto" w:fill="F3F4F6"/>
         </w:rPr>
-        <w:t xml:space="preserve">SeniorityCertificateRenderer.sol</w:t>
-      </w:r>
-      <w:r>
-        <w:rPr>
-          <w:sz w:val="21"/>
-          <w:color w:val="1F1F1F"/>
-        </w:rPr>
-        <w:t xml:space="preserve"> and </w:t>
+        <w:t xml:space="preserve">MINT_BURN</w:t>
+      </w:r>
+      <w:r>
+        <w:rPr>
+          <w:sz w:val="21"/>
+          <w:color w:val="1F1F1F"/>
+        </w:rPr>
+        <w:t xml:space="preserve">) directly to the blackhole dead address </w:t>
       </w:r>
       <w:r>
         <w:rPr>
@@ -3969,6 +4466,246 @@
           <w:color w:val="1C2422"/>
           <w:shd w:val="clear" w:color="auto" w:fill="F3F4F6"/>
         </w:rPr>
+        <w:t xml:space="preserve">0x000000000000000000000000000000000000dEaD</w:t>
+      </w:r>
+      <w:r>
+        <w:rPr>
+          <w:sz w:val="21"/>
+          <w:color w:val="1F1F1F"/>
+        </w:rPr>
+        <w:t xml:space="preserve">, achieving factual permanent removal from circulation (underlying token </w:t>
+      </w:r>
+      <w:r>
+        <w:rPr>
+          <w:rFonts w:ascii="Menlo" w:hAnsi="Menlo"/>
+          <w:sz w:val="19"/>
+          <w:color w:val="1C2422"/>
+          <w:shd w:val="clear" w:color="auto" w:fill="F3F4F6"/>
+        </w:rPr>
+        <w:t xml:space="preserve">transfer(DEAD, MINT_BURN)</w:t>
+      </w:r>
+      <w:r>
+        <w:rPr>
+          <w:sz w:val="21"/>
+          <w:color w:val="1F1F1F"/>
+        </w:rPr>
+        <w:t xml:space="preserve">, not a </w:t>
+      </w:r>
+      <w:r>
+        <w:rPr>
+          <w:rFonts w:ascii="Menlo" w:hAnsi="Menlo"/>
+          <w:sz w:val="19"/>
+          <w:color w:val="1C2422"/>
+          <w:shd w:val="clear" w:color="auto" w:fill="F3F4F6"/>
+        </w:rPr>
+        <w:t xml:space="preserve">burn()</w:t>
+      </w:r>
+      <w:r>
+        <w:rPr>
+          <w:sz w:val="21"/>
+          <w:color w:val="1F1F1F"/>
+        </w:rPr>
+        <w:t xml:space="preserve"> call that reduces </w:t>
+      </w:r>
+      <w:r>
+        <w:rPr>
+          <w:rFonts w:ascii="Menlo" w:hAnsi="Menlo"/>
+          <w:sz w:val="19"/>
+          <w:color w:val="1C2422"/>
+          <w:shd w:val="clear" w:color="auto" w:fill="F3F4F6"/>
+        </w:rPr>
+        <w:t xml:space="preserve">totalSupply</w:t>
+      </w:r>
+      <w:r>
+        <w:rPr>
+          <w:sz w:val="21"/>
+          <w:color w:val="1F1F1F"/>
+        </w:rPr>
+        <w:t xml:space="preserve">); remaining principal is refunded to the user;</w:t>
+      </w:r>
+    </w:p>
+    <w:p>
+      <w:pPr>
+        <w:pStyle w:val="ListBullet"/>
+      </w:pPr>
+      <w:r>
+        <w:rPr>
+          <w:color w:val="0F5C46"/>
+        </w:rPr>
+        <w:t xml:space="preserve">•  </w:t>
+      </w:r>
+      <w:r>
+        <w:rPr>
+          <w:b/>
+          <w:sz w:val="21"/>
+          <w:szCs w:val="21"/>
+          <w:color w:val="1F1F1F"/>
+        </w:rPr>
+        <w:t xml:space="preserve">Certificate Staking &amp; Threshold Exemption</w:t>
+      </w:r>
+      <w:r>
+        <w:rPr>
+          <w:sz w:val="21"/>
+          <w:color w:val="1F1F1F"/>
+        </w:rPr>
+        <w:t xml:space="preserve">: Holders of an unallocated certificate can call </w:t>
+      </w:r>
+      <w:r>
+        <w:rPr>
+          <w:rFonts w:ascii="Menlo" w:hAnsi="Menlo"/>
+          <w:sz w:val="19"/>
+          <w:color w:val="1C2422"/>
+          <w:shd w:val="clear" w:color="auto" w:fill="F3F4F6"/>
+        </w:rPr>
+        <w:t xml:space="preserve">stakeWithCertificate(principal, diet, certificateId)</w:t>
+      </w:r>
+      <w:r>
+        <w:rPr>
+          <w:sz w:val="21"/>
+          <w:color w:val="1F1F1F"/>
+        </w:rPr>
+        <w:t xml:space="preserve"> to open a position, inheriting the certificate's starting multiplier (head-start </w:t>
+      </w:r>
+      <w:r>
+        <w:rPr>
+          <w:i/>
+          <w:sz w:val="21"/>
+          <w:color w:val="1C2422"/>
+        </w:rPr>
+        <w:t xml:space="preserve">\text{head} = \text{multiplier} - 1</w:t>
+      </w:r>
+      <w:r>
+        <w:rPr>
+          <w:sz w:val="21"/>
+          <w:color w:val="1F1F1F"/>
+        </w:rPr>
+        <w:t xml:space="preserve">) and exempt from the </w:t>
+      </w:r>
+      <w:r>
+        <w:rPr>
+          <w:rFonts w:ascii="Menlo" w:hAnsi="Menlo"/>
+          <w:sz w:val="19"/>
+          <w:color w:val="1C2422"/>
+          <w:shd w:val="clear" w:color="auto" w:fill="F3F4F6"/>
+        </w:rPr>
+        <w:t xml:space="preserve">minStake</w:t>
+      </w:r>
+      <w:r>
+        <w:rPr>
+          <w:sz w:val="21"/>
+          <w:color w:val="1F1F1F"/>
+        </w:rPr>
+        <w:t xml:space="preserve"> requirement. The certificate is exclusively locked (</w:t>
+      </w:r>
+      <w:r>
+        <w:rPr>
+          <w:rFonts w:ascii="Menlo" w:hAnsi="Menlo"/>
+          <w:sz w:val="19"/>
+          <w:color w:val="1C2422"/>
+          <w:shd w:val="clear" w:color="auto" w:fill="F3F4F6"/>
+        </w:rPr>
+        <w:t xml:space="preserve">inUse == true</w:t>
+      </w:r>
+      <w:r>
+        <w:rPr>
+          <w:sz w:val="21"/>
+          <w:color w:val="1F1F1F"/>
+        </w:rPr>
+        <w:t xml:space="preserve">) during the position's lifetime and released upon exit. Re-issuing another certificate from a certificate-backed position is strictly prohibited;</w:t>
+      </w:r>
+    </w:p>
+    <w:p>
+      <w:pPr>
+        <w:pStyle w:val="ListBullet"/>
+      </w:pPr>
+      <w:r>
+        <w:rPr>
+          <w:color w:val="0F5C46"/>
+        </w:rPr>
+        <w:t xml:space="preserve">•  </w:t>
+      </w:r>
+      <w:r>
+        <w:rPr>
+          <w:b/>
+          <w:sz w:val="21"/>
+          <w:szCs w:val="21"/>
+          <w:color w:val="1F1F1F"/>
+        </w:rPr>
+        <w:t xml:space="preserve">Fixed Hard Cap &amp; Cold-Start Lock</w:t>
+      </w:r>
+      <w:r>
+        <w:rPr>
+          <w:sz w:val="21"/>
+          <w:color w:val="1F1F1F"/>
+        </w:rPr>
+        <w:t xml:space="preserve">: Capped at 10,000 tokens; minting opens once 21 days after deployment (</w:t>
+      </w:r>
+      <w:r>
+        <w:rPr>
+          <w:rFonts w:ascii="Menlo" w:hAnsi="Menlo"/>
+          <w:sz w:val="19"/>
+          <w:color w:val="1C2422"/>
+          <w:shd w:val="clear" w:color="auto" w:fill="F3F4F6"/>
+        </w:rPr>
+        <w:t xml:space="preserve">deploy + MINT_DELAY</w:t>
+      </w:r>
+      <w:r>
+        <w:rPr>
+          <w:sz w:val="21"/>
+          <w:color w:val="1F1F1F"/>
+        </w:rPr>
+        <w:t xml:space="preserve">); no per-mint cooldown;</w:t>
+      </w:r>
+    </w:p>
+    <w:p>
+      <w:pPr>
+        <w:pStyle w:val="ListBullet"/>
+      </w:pPr>
+      <w:r>
+        <w:rPr>
+          <w:color w:val="0F5C46"/>
+        </w:rPr>
+        <w:t xml:space="preserve">•  </w:t>
+      </w:r>
+      <w:r>
+        <w:rPr>
+          <w:b/>
+          <w:sz w:val="21"/>
+          <w:szCs w:val="21"/>
+          <w:color w:val="1F1F1F"/>
+        </w:rPr>
+        <w:t xml:space="preserve">Pure On-Chain SVG Rendering</w:t>
+      </w:r>
+      <w:r>
+        <w:rPr>
+          <w:sz w:val="21"/>
+          <w:color w:val="1F1F1F"/>
+        </w:rPr>
+        <w:t xml:space="preserve">: Vector artwork and metadata are generated dynamically purely on-chain by </w:t>
+      </w:r>
+      <w:r>
+        <w:rPr>
+          <w:rFonts w:ascii="Menlo" w:hAnsi="Menlo"/>
+          <w:sz w:val="19"/>
+          <w:color w:val="1C2422"/>
+          <w:shd w:val="clear" w:color="auto" w:fill="F3F4F6"/>
+        </w:rPr>
+        <w:t xml:space="preserve">SeniorityCertificateRenderer.sol</w:t>
+      </w:r>
+      <w:r>
+        <w:rPr>
+          <w:sz w:val="21"/>
+          <w:color w:val="1F1F1F"/>
+        </w:rPr>
+        <w:t xml:space="preserve"> and </w:t>
+      </w:r>
+      <w:r>
+        <w:rPr>
+          <w:rFonts w:ascii="Menlo" w:hAnsi="Menlo"/>
+          <w:sz w:val="19"/>
+          <w:color w:val="1C2422"/>
+          <w:shd w:val="clear" w:color="auto" w:fill="F3F4F6"/>
+        </w:rPr>
         <w:t xml:space="preserve">CertificateData.sol</w:t>
       </w:r>
       <w:r>
@@ -3976,7 +4713,71 @@
           <w:sz w:val="21"/>
           <w:color w:val="1F1F1F"/>
         </w:rPr>
-        <w:t xml:space="preserve"> without centralized servers or IPFS dependencies.</w:t>
+        <w:t xml:space="preserve">. Metadata attributes are strictly </w:t>
+      </w:r>
+      <w:r>
+        <w:rPr>
+          <w:rFonts w:ascii="Menlo" w:hAnsi="Menlo"/>
+          <w:sz w:val="19"/>
+          <w:color w:val="1C2422"/>
+          <w:shd w:val="clear" w:color="auto" w:fill="F3F4F6"/>
+        </w:rPr>
+        <w:t xml:space="preserve">Starting multiplier</w:t>
+      </w:r>
+      <w:r>
+        <w:rPr>
+          <w:sz w:val="21"/>
+          <w:color w:val="1F1F1F"/>
+        </w:rPr>
+        <w:t xml:space="preserve"> and </w:t>
+      </w:r>
+      <w:r>
+        <w:rPr>
+          <w:rFonts w:ascii="Menlo" w:hAnsi="Menlo"/>
+          <w:sz w:val="19"/>
+          <w:color w:val="1C2422"/>
+          <w:shd w:val="clear" w:color="auto" w:fill="F3F4F6"/>
+        </w:rPr>
+        <w:t xml:space="preserve">Status</w:t>
+      </w:r>
+      <w:r>
+        <w:rPr>
+          <w:sz w:val="21"/>
+          <w:color w:val="1F1F1F"/>
+        </w:rPr>
+        <w:t xml:space="preserve"> (</w:t>
+      </w:r>
+      <w:r>
+        <w:rPr>
+          <w:rFonts w:ascii="Menlo" w:hAnsi="Menlo"/>
+          <w:sz w:val="19"/>
+          <w:color w:val="1C2422"/>
+          <w:shd w:val="clear" w:color="auto" w:fill="F3F4F6"/>
+        </w:rPr>
+        <w:t xml:space="preserve">In use</w:t>
+      </w:r>
+      <w:r>
+        <w:rPr>
+          <w:sz w:val="21"/>
+          <w:color w:val="1F1F1F"/>
+        </w:rPr>
+        <w:t xml:space="preserve"> or </w:t>
+      </w:r>
+      <w:r>
+        <w:rPr>
+          <w:rFonts w:ascii="Menlo" w:hAnsi="Menlo"/>
+          <w:sz w:val="19"/>
+          <w:color w:val="1C2422"/>
+          <w:shd w:val="clear" w:color="auto" w:fill="F3F4F6"/>
+        </w:rPr>
+        <w:t xml:space="preserve">Available</w:t>
+      </w:r>
+      <w:r>
+        <w:rPr>
+          <w:sz w:val="21"/>
+          <w:color w:val="1F1F1F"/>
+        </w:rPr>
+        <w:t xml:space="preserve">), with zero external dependencies on centralized servers or IPFS.</w:t>
       </w:r>
     </w:p>
     <w:p>
@@ -5093,16 +5894,16 @@
         <w:pStyle w:val="Subtitle"/>
       </w:pPr>
       <w:r>
-        <w:t>6.4 Genesis Launch Sequence &amp; Dual-Gate Cold Start</w:t>
-      </w:r>
-    </w:p>
-    <w:p>
-      <w:r>
-        <w:rPr>
-          <w:sz w:val="22"/>
-          <w:color w:val="1F1F1F"/>
-        </w:rPr>
-        <w:t xml:space="preserve">The transition from initial token minting to a continuous dividend-paying state machine is governed by an explicit chronological sequence enforced across physical wall-clock gates:</w:t>
+        <w:t>6.4 Genesis Launch Sequence &amp; Two Independent Seven-Day Gates</w:t>
+      </w:r>
+    </w:p>
+    <w:p>
+      <w:r>
+        <w:rPr>
+          <w:sz w:val="22"/>
+          <w:color w:val="1F1F1F"/>
+        </w:rPr>
+        <w:t xml:space="preserve">Tax collection, staking deployment and staking opening are separate events. The one-time staking opening—not deployment or graduation—starts the seven-day reward clock:</w:t>
       </w:r>
     </w:p>
     <w:p>
@@ -5115,15 +5916,18 @@
           <w:sz w:val="18"/>
           <w:color w:val="1C2422"/>
         </w:rPr>
-        <w:t xml:space="preserve">[ Stage 0: Flap Curve ] ──► [ Stage 1: Graduation &amp; Migration ] ──► [ Stage 2: FEED Gate Open ]
-Token trading opens         PancakeSwap V2 pair seeded;             Production staking deployed;
-4% tax accrues to vault     TWAP observations accumulate            Staking deposits open
-                                                                            │
-                                                                            ▼
-[ Stage 4: Steady Emissions ] ◄─── [ Stage 3: 7-Day Dual Wall-Clock Accumulation ]
-Belly releases open via Router;     • Emission Delay: Distributions remain zero for first 7 days
-Batch market execution active       • Vault Outflow Timelock: 7-day spender activation window
-Seniority notches mature (up to 22) • Flap taxes flush to Belly ("accumulate only, zero outflow")</w:t>
+        <w:t xml:space="preserve">[ Flap token launch ] ──► [ Tax flows to Belly; staking graph may deploy CLOSED ]
+                                  │
+                 Governor opens early OR anyone opens after graduation
+                                  ▼
+                       [ Staking deposits open ]
+                                  │ exactly 7 days: allocation = 0
+                                  ▼
+                   [ Day 8: reward time eligible ]
+                                  │ later interval advance + route settlement
+                                  ▼
+                       [ Claimable rewards ]
+Separate gate: Belly Spender proposal → 7-day timelock → Governor activation.</w:t>
       </w:r>
     </w:p>
     <w:p>
@@ -5144,14 +5948,42 @@
           <w:szCs w:val="21"/>
           <w:color w:val="1F1F1F"/>
         </w:rPr>
-        <w:t xml:space="preserve">Stage 0: Bonding Curve Launch</w:t>
-      </w:r>
-      <w:r>
-        <w:rPr>
-          <w:sz w:val="21"/>
-          <w:color w:val="1F1F1F"/>
-        </w:rPr>
-        <w:t xml:space="preserve">: FATCAT trading initiates exclusively on Flap's bonding curve. The Flap TaxProcessor recognizes trading volume and routes nominal creator revenue to </w:t>
+        <w:t xml:space="preserve">Token Launch &amp; Tax Collection</w:t>
+      </w:r>
+      <w:r>
+        <w:rPr>
+          <w:sz w:val="21"/>
+          <w:color w:val="1F1F1F"/>
+        </w:rPr>
+        <w:t xml:space="preserve">: FATCAT begins trading on Flap's bonding curve. Its forwarding vault routes creator revenue to The Belly independently of whether staking contracts exist or accept deposits. Flap may later graduate liquidity to PancakeSwap V2; post-graduation tax continues;</w:t>
+      </w:r>
+    </w:p>
+    <w:p>
+      <w:pPr>
+        <w:pStyle w:val="ListBullet"/>
+      </w:pPr>
+      <w:r>
+        <w:rPr>
+          <w:b/>
+          <w:color w:val="0F5C46"/>
+        </w:rPr>
+        <w:t xml:space="preserve">2.  </w:t>
+      </w:r>
+      <w:r>
+        <w:rPr>
+          <w:b/>
+          <w:sz w:val="21"/>
+          <w:szCs w:val="21"/>
+          <w:color w:val="1F1F1F"/>
+        </w:rPr>
+        <w:t xml:space="preserve">Closed Staking Deployment</w:t>
+      </w:r>
+      <w:r>
+        <w:rPr>
+          <w:sz w:val="21"/>
+          <w:color w:val="1F1F1F"/>
+        </w:rPr>
+        <w:t xml:space="preserve">: After token launch and initial reward-route review, the production staking graph may deploy before graduation. It accepts Flap states 0–4 but starts with deposits and interval advances disabled, </w:t>
       </w:r>
       <w:r>
         <w:rPr>
@@ -5160,7 +5992,7 @@
           <w:color w:val="1C2422"/>
           <w:shd w:val="clear" w:color="auto" w:fill="F3F4F6"/>
         </w:rPr>
-        <w:t xml:space="preserve">FatCatStakingVault</w:t>
+        <w:t xml:space="preserve">stakingOpenedAt = rewardStartAt = 0</w:t>
       </w:r>
       <w:r>
         <w:rPr>
@@ -5179,7 +6011,7 @@
           <w:b/>
           <w:color w:val="0F5C46"/>
         </w:rPr>
-        <w:t xml:space="preserve">2.  </w:t>
+        <w:t xml:space="preserve">3.  </w:t>
       </w:r>
       <w:r>
         <w:rPr>
@@ -5188,14 +6020,14 @@
           <w:szCs w:val="21"/>
           <w:color w:val="1F1F1F"/>
         </w:rPr>
-        <w:t xml:space="preserve">Stage 1: Graduation &amp; Liquidity Migration</w:t>
-      </w:r>
-      <w:r>
-        <w:rPr>
-          <w:sz w:val="21"/>
-          <w:color w:val="1F1F1F"/>
-        </w:rPr>
-        <w:t xml:space="preserve">: Upon reaching the curve target (24 BNB), Flap atomically migrates liquidity to PancakeSwap V2 (</w:t>
+        <w:t xml:space="preserve">One-Time Staking Opening</w:t>
+      </w:r>
+      <w:r>
+        <w:rPr>
+          <w:sz w:val="21"/>
+          <w:color w:val="1F1F1F"/>
+        </w:rPr>
+        <w:t xml:space="preserve">: Before graduation only Governor may call </w:t>
       </w:r>
       <w:r>
         <w:rPr>
@@ -5204,14 +6036,46 @@
           <w:color w:val="1C2422"/>
           <w:shd w:val="clear" w:color="auto" w:fill="F3F4F6"/>
         </w:rPr>
-        <w:t xml:space="preserve">FATCAT/WBNB</w:t>
-      </w:r>
-      <w:r>
-        <w:rPr>
-          <w:sz w:val="21"/>
-          <w:color w:val="1F1F1F"/>
-        </w:rPr>
-        <w:t xml:space="preserve">), establishing the canonical trading pair. Post-graduation trading tax remains active;</w:t>
+        <w:t xml:space="preserve">vault.openStaking()</w:t>
+      </w:r>
+      <w:r>
+        <w:rPr>
+          <w:sz w:val="21"/>
+          <w:color w:val="1F1F1F"/>
+        </w:rPr>
+        <w:t xml:space="preserve">; once Flap </w:t>
+      </w:r>
+      <w:r>
+        <w:rPr>
+          <w:rFonts w:ascii="Menlo" w:hAnsi="Menlo"/>
+          <w:sz w:val="19"/>
+          <w:color w:val="1C2422"/>
+          <w:shd w:val="clear" w:color="auto" w:fill="F3F4F6"/>
+        </w:rPr>
+        <w:t xml:space="preserve">state()</w:t>
+      </w:r>
+      <w:r>
+        <w:rPr>
+          <w:sz w:val="21"/>
+          <w:color w:val="1F1F1F"/>
+        </w:rPr>
+        <w:t xml:space="preserve"> is 2–4, anyone may trigger it if still closed. This transaction opens deposits and fixes </w:t>
+      </w:r>
+      <w:r>
+        <w:rPr>
+          <w:rFonts w:ascii="Menlo" w:hAnsi="Menlo"/>
+          <w:sz w:val="19"/>
+          <w:color w:val="1C2422"/>
+          <w:shd w:val="clear" w:color="auto" w:fill="F3F4F6"/>
+        </w:rPr>
+        <w:t xml:space="preserve">rewardStartAt = stakingOpenedAt + 7 days</w:t>
+      </w:r>
+      <w:r>
+        <w:rPr>
+          <w:sz w:val="21"/>
+          <w:color w:val="1F1F1F"/>
+        </w:rPr>
+        <w:t xml:space="preserve">. An intentionally early opening can place day eight before Flap graduation. FATCAT as a reward asset still requires graduation, route verification and oracle warm-up;</w:t>
       </w:r>
     </w:p>
     <w:p>
@@ -5223,7 +6087,7 @@
           <w:b/>
           <w:color w:val="0F5C46"/>
         </w:rPr>
-        <w:t xml:space="preserve">3.  </w:t>
+        <w:t xml:space="preserve">4.  </w:t>
       </w:r>
       <w:r>
         <w:rPr>
@@ -5232,14 +6096,30 @@
           <w:szCs w:val="21"/>
           <w:color w:val="1F1F1F"/>
         </w:rPr>
-        <w:t xml:space="preserve">Stage 2: Staking Deployment &amp; FEED Gate</w:t>
-      </w:r>
-      <w:r>
-        <w:rPr>
-          <w:sz w:val="21"/>
-          <w:color w:val="1F1F1F"/>
-        </w:rPr>
-        <w:t xml:space="preserve">: Once live pair routing is verified and TWAP price accumulators are initialized, production staking contracts are deployed. Deposits are unlocked immediately for stakers to secure initial positions;</w:t>
+        <w:t xml:space="preserve">Two Independent Seven-Day Gates</w:t>
+      </w:r>
+      <w:r>
+        <w:rPr>
+          <w:sz w:val="21"/>
+          <w:color w:val="1F1F1F"/>
+        </w:rPr>
+        <w:t xml:space="preserve">: The first seven full days after staking opens accumulate seniority and tax reserves but allocate zero rewards, without later back-pay. Governance separately proposes </w:t>
+      </w:r>
+      <w:r>
+        <w:rPr>
+          <w:rFonts w:ascii="Menlo" w:hAnsi="Menlo"/>
+          <w:sz w:val="19"/>
+          <w:color w:val="1C2422"/>
+          <w:shd w:val="clear" w:color="auto" w:fill="F3F4F6"/>
+        </w:rPr>
+        <w:t xml:space="preserve">ExecutionRouter</w:t>
+      </w:r>
+      <w:r>
+        <w:rPr>
+          <w:sz w:val="21"/>
+          <w:color w:val="1F1F1F"/>
+        </w:rPr>
+        <w:t xml:space="preserve"> as Belly Spender; its own seven-day timelock begins at proposal, not staking opening, and activation may occur later;</w:t>
       </w:r>
     </w:p>
     <w:p>
@@ -5251,7 +6131,7 @@
           <w:b/>
           <w:color w:val="0F5C46"/>
         </w:rPr>
-        <w:t xml:space="preserve">4.  </w:t>
+        <w:t xml:space="preserve">5.  </w:t>
       </w:r>
       <w:r>
         <w:rPr>
@@ -5260,83 +6140,14 @@
           <w:szCs w:val="21"/>
           <w:color w:val="1F1F1F"/>
         </w:rPr>
-        <w:t xml:space="preserve">Stage 3: Dual 7-Day Wall-Clock Accumulation Gates</w:t>
-      </w:r>
-      <w:r>
-        <w:rPr>
-          <w:sz w:val="21"/>
-          <w:color w:val="1F1F1F"/>
-        </w:rPr>
-        <w:t xml:space="preserve">: To eliminate unfair early-block dividend extraction and allow all launch participants to scale their seniority ladders (</w:t>
-      </w:r>
-      <w:r>
-        <w:rPr>
-          <w:i/>
-          <w:sz w:val="21"/>
-          <w:color w:val="1C2422"/>
-        </w:rPr>
-        <w:t xml:space="preserve">c_i \in [1, 22]</w:t>
-      </w:r>
-      <w:r>
-        <w:rPr>
-          <w:sz w:val="21"/>
-          <w:color w:val="1F1F1F"/>
-        </w:rPr>
-        <w:t xml:space="preserve">) on an equal footing, the contracts enforce two parallel physical barriers:</w:t>
-      </w:r>
-    </w:p>
-    <w:p>
-      <w:pPr>
-        <w:pStyle w:val="ListBullet"/>
-      </w:pPr>
-      <w:r>
-        <w:rPr>
-          <w:color w:val="0F5C46"/>
-        </w:rPr>
-        <w:t xml:space="preserve">•  </w:t>
-      </w:r>
-      <w:r>
-        <w:rPr>
-          <w:b/>
-          <w:sz w:val="21"/>
-          <w:szCs w:val="21"/>
-          <w:color w:val="1F1F1F"/>
-        </w:rPr>
-        <w:t xml:space="preserve">Reward Emission Delay</w:t>
-      </w:r>
-      <w:r>
-        <w:rPr>
-          <w:sz w:val="21"/>
-          <w:color w:val="1F1F1F"/>
-        </w:rPr>
-        <w:t xml:space="preserve">: Pinned to an immutable 7-day wall-clock delay. Throughout this window, interval advances rotate the graduation ring and increment staker seniority notches normally, but dividend calculations yield zero. The cold-start week is never retroactively paid;</w:t>
-      </w:r>
-    </w:p>
-    <w:p>
-      <w:pPr>
-        <w:pStyle w:val="ListBullet"/>
-      </w:pPr>
-      <w:r>
-        <w:rPr>
-          <w:color w:val="0F5C46"/>
-        </w:rPr>
-        <w:t xml:space="preserve">•  </w:t>
-      </w:r>
-      <w:r>
-        <w:rPr>
-          <w:b/>
-          <w:sz w:val="21"/>
-          <w:szCs w:val="21"/>
-          <w:color w:val="1F1F1F"/>
-        </w:rPr>
-        <w:t xml:space="preserve">Treasury Outflow Delay</w:t>
-      </w:r>
-      <w:r>
-        <w:rPr>
-          <w:sz w:val="21"/>
-          <w:color w:val="1F1F1F"/>
-        </w:rPr>
-        <w:t xml:space="preserve">: The authorized </w:t>
+        <w:t xml:space="preserve">Settlement &amp; Claimable Rewards</w:t>
+      </w:r>
+      <w:r>
+        <w:rPr>
+          <w:sz w:val="21"/>
+          <w:color w:val="1F1F1F"/>
+        </w:rPr>
+        <w:t xml:space="preserve">: Reaching </w:t>
       </w:r>
       <w:r>
         <w:rPr>
@@ -5345,41 +6156,14 @@
           <w:color w:val="1C2422"/>
           <w:shd w:val="clear" w:color="auto" w:fill="F3F4F6"/>
         </w:rPr>
-        <w:t xml:space="preserve">ExecutionRouter</w:t>
-      </w:r>
-      <w:r>
-        <w:rPr>
-          <w:sz w:val="21"/>
-          <w:color w:val="1F1F1F"/>
-        </w:rPr>
-        <w:t xml:space="preserve"> proposal must wait for a 7-day physical timelock before activation. During this period, The Belly has zero active spenders, guaranteeing zero capital drawdown;</w:t>
-      </w:r>
-    </w:p>
-    <w:p>
-      <w:pPr>
-        <w:pStyle w:val="ListBullet"/>
-      </w:pPr>
-      <w:r>
-        <w:rPr>
-          <w:color w:val="0F5C46"/>
-        </w:rPr>
-        <w:t xml:space="preserve">•  </w:t>
-      </w:r>
-      <w:r>
-        <w:rPr>
-          <w:b/>
-          <w:sz w:val="21"/>
-          <w:szCs w:val="21"/>
-          <w:color w:val="1F1F1F"/>
-        </w:rPr>
-        <w:t xml:space="preserve">Reservoir Buffer Build-Up</w:t>
-      </w:r>
-      <w:r>
-        <w:rPr>
-          <w:sz w:val="21"/>
-          <w:color w:val="1F1F1F"/>
-        </w:rPr>
-        <w:t xml:space="preserve">: Taxes collected from PancakeSwap volume continue to be forwarded via </w:t>
+        <w:t xml:space="preserve">rewardStartAt</w:t>
+      </w:r>
+      <w:r>
+        <w:rPr>
+          <w:sz w:val="21"/>
+          <w:color w:val="1F1F1F"/>
+        </w:rPr>
+        <w:t xml:space="preserve"> automatically changes reward eligibility, but cannot send a transaction or guarantee a payout at that instant. The first claimable reward requires a later </w:t>
       </w:r>
       <w:r>
         <w:rPr>
@@ -5388,58 +6172,14 @@
           <w:color w:val="1C2422"/>
           <w:shd w:val="clear" w:color="auto" w:fill="F3F4F6"/>
         </w:rPr>
-        <w:t xml:space="preserve">flush()</w:t>
-      </w:r>
-      <w:r>
-        <w:rPr>
-          <w:sz w:val="21"/>
-          <w:color w:val="1F1F1F"/>
-        </w:rPr>
-        <w:t xml:space="preserve">, filling The Belly with quote reserves;</w:t>
-      </w:r>
-    </w:p>
-    <w:p>
-      <w:pPr>
-        <w:pStyle w:val="ListBullet"/>
-      </w:pPr>
-      <w:r>
-        <w:rPr>
-          <w:b/>
-          <w:color w:val="0F5C46"/>
-        </w:rPr>
-        <w:t xml:space="preserve">5.  </w:t>
-      </w:r>
-      <w:r>
-        <w:rPr>
-          <w:b/>
-          <w:sz w:val="21"/>
-          <w:szCs w:val="21"/>
-          <w:color w:val="1F1F1F"/>
-        </w:rPr>
-        <w:t xml:space="preserve">Stage 4: Steady-State Protocol Emissions</w:t>
-      </w:r>
-      <w:r>
-        <w:rPr>
-          <w:sz w:val="21"/>
-          <w:color w:val="1F1F1F"/>
-        </w:rPr>
-        <w:t xml:space="preserve">: Following the expiration of both 7-day gates, </w:t>
-      </w:r>
-      <w:r>
-        <w:rPr>
-          <w:rFonts w:ascii="Menlo" w:hAnsi="Menlo"/>
-          <w:sz w:val="19"/>
-          <w:color w:val="1C2422"/>
-          <w:shd w:val="clear" w:color="auto" w:fill="F3F4F6"/>
-        </w:rPr>
-        <w:t xml:space="preserve">ExecutionRouter</w:t>
-      </w:r>
-      <w:r>
-        <w:rPr>
-          <w:sz w:val="21"/>
-          <w:color w:val="1F1F1F"/>
-        </w:rPr>
-        <w:t xml:space="preserve"> is permanently activated. Protocol releases begin, distributing quote reserves according to the discrete damping formula to stakers holding mature seniority weights.</w:t>
+        <w:t xml:space="preserve">advance()</w:t>
+      </w:r>
+      <w:r>
+        <w:rPr>
+          <w:sz w:val="21"/>
+          <w:color w:val="1F1F1F"/>
+        </w:rPr>
+        <w:t xml:space="preserve"> closing an interval with eligible time, an activated Belly Spender, and route execution or fallback settlement. Keeper operation targets prompt settlement, not second-exact block inclusion.</w:t>
       </w:r>
     </w:p>
     <w:p>
@@ -8633,7 +9373,22 @@
           <w:sz w:val="22"/>
           <w:color w:val="1F1F1F"/>
         </w:rPr>
-        <w:t xml:space="preserve"> permanently vests within the distributor contract. Physical token balances held by the contract strictly dominate recorded accounting liabilities.</w:t>
+        <w:t xml:space="preserve"> permanently vests within the distributor contract, guaranteeing that physical token balances held by the contract are always greater than or equal to recorded accounting liabilities (</w:t>
+      </w:r>
+      <w:r>
+        <w:rPr>
+          <w:i/>
+          <w:sz w:val="22"/>
+          <w:color w:val="1C2422"/>
+        </w:rPr>
+        <w:t xml:space="preserve">\text{Balance} \ge \text{Liability}</w:t>
+      </w:r>
+      <w:r>
+        <w:rPr>
+          <w:sz w:val="22"/>
+          <w:color w:val="1F1F1F"/>
+        </w:rPr>
+        <w:t xml:space="preserve">).</w:t>
       </w:r>
     </w:p>
     <w:p>
@@ -9065,28 +9820,21 @@
                 <w:color w:val="1C2422"/>
                 <w:shd w:val="clear" w:color="auto" w:fill="F3F4F6"/>
               </w:rPr>
-              <w:t xml:space="preserve">StakingVault.stake()</w:t>
-            </w:r>
-            <w:r>
-              <w:rPr>
-                <w:sz w:val="19"/>
-                <w:color w:val="1F1F1F"/>
-              </w:rPr>
-              <w:t xml:space="preserve"> (Add Principal)</w:t>
-            </w:r>
-          </w:p>
-        </w:tc>
-        <w:tc>
-          <w:p>
-            <w:pPr>
-              <w:spacing w:before="40" w:after="40"/>
-            </w:pPr>
-            <w:r>
-              <w:rPr>
-                <w:sz w:val="19"/>
-                <w:color w:val="1F1F1F"/>
-              </w:rPr>
-              <w:t xml:space="preserve">User</w:t>
+              <w:t xml:space="preserve">StakingVault.stakeWithCertificate()</w:t>
+            </w:r>
+          </w:p>
+        </w:tc>
+        <w:tc>
+          <w:p>
+            <w:pPr>
+              <w:spacing w:before="40" w:after="40"/>
+            </w:pPr>
+            <w:r>
+              <w:rPr>
+                <w:sz w:val="19"/>
+                <w:color w:val="1F1F1F"/>
+              </w:rPr>
+              <w:t xml:space="preserve">Holder</w:t>
             </w:r>
           </w:p>
         </w:tc>
@@ -9129,21 +9877,37 @@
                 <w:sz w:val="19"/>
                 <w:color w:val="1F1F1F"/>
               </w:rPr>
-              <w:t xml:space="preserve">~98,200</w:t>
-            </w:r>
-          </w:p>
-        </w:tc>
-        <w:tc>
-          <w:p>
-            <w:pPr>
-              <w:spacing w:before="40" w:after="40"/>
-            </w:pPr>
-            <w:r>
-              <w:rPr>
-                <w:sz w:val="19"/>
-                <w:color w:val="1F1F1F"/>
-              </w:rPr>
-              <w:t xml:space="preserve">Incremental deposit to existing position; updates scalar accumulators</w:t>
+              <w:t xml:space="preserve">~168,000</w:t>
+            </w:r>
+          </w:p>
+        </w:tc>
+        <w:tc>
+          <w:p>
+            <w:pPr>
+              <w:spacing w:before="40" w:after="40"/>
+            </w:pPr>
+            <w:r>
+              <w:rPr>
+                <w:sz w:val="19"/>
+                <w:color w:val="1F1F1F"/>
+              </w:rPr>
+              <w:t xml:space="preserve">Locks certificate and introduces starting multiplier; exempt from </w:t>
+            </w:r>
+            <w:r>
+              <w:rPr>
+                <w:rFonts w:ascii="Menlo" w:hAnsi="Menlo"/>
+                <w:sz w:val="17"/>
+                <w:color w:val="1C2422"/>
+                <w:shd w:val="clear" w:color="auto" w:fill="F3F4F6"/>
+              </w:rPr>
+              <w:t xml:space="preserve">minStake</w:t>
+            </w:r>
+            <w:r>
+              <w:rPr>
+                <w:sz w:val="19"/>
+                <w:color w:val="1F1F1F"/>
+              </w:rPr>
+              <w:t xml:space="preserve"> floor</w:t>
             </w:r>
           </w:p>
         </w:tc>
@@ -9161,14 +9925,14 @@
                 <w:color w:val="1C2422"/>
                 <w:shd w:val="clear" w:color="auto" w:fill="F3F4F6"/>
               </w:rPr>
-              <w:t xml:space="preserve">StakingVault.redeem()</w:t>
-            </w:r>
-            <w:r>
-              <w:rPr>
-                <w:sz w:val="19"/>
-                <w:color w:val="1F1F1F"/>
-              </w:rPr>
-              <w:t xml:space="preserve"> (Unstake)</w:t>
+              <w:t xml:space="preserve">StakingVault.stake()</w:t>
+            </w:r>
+            <w:r>
+              <w:rPr>
+                <w:sz w:val="19"/>
+                <w:color w:val="1F1F1F"/>
+              </w:rPr>
+              <w:t xml:space="preserve"> (Add Principal)</w:t>
             </w:r>
           </w:p>
         </w:tc>
@@ -9225,21 +9989,21 @@
                 <w:sz w:val="19"/>
                 <w:color w:val="1F1F1F"/>
               </w:rPr>
-              <w:t xml:space="preserve">~125,600</w:t>
-            </w:r>
-          </w:p>
-        </w:tc>
-        <w:tc>
-          <w:p>
-            <w:pPr>
-              <w:spacing w:before="40" w:after="40"/>
-            </w:pPr>
-            <w:r>
-              <w:rPr>
-                <w:sz w:val="19"/>
-                <w:color w:val="1F1F1F"/>
-              </w:rPr>
-              <w:t xml:space="preserve">100% principal return; logs mid-interval exit and zeroes active seniority weight</w:t>
+              <w:t xml:space="preserve">~98,200</w:t>
+            </w:r>
+          </w:p>
+        </w:tc>
+        <w:tc>
+          <w:p>
+            <w:pPr>
+              <w:spacing w:before="40" w:after="40"/>
+            </w:pPr>
+            <w:r>
+              <w:rPr>
+                <w:sz w:val="19"/>
+                <w:color w:val="1F1F1F"/>
+              </w:rPr>
+              <w:t xml:space="preserve">Incremental deposit to existing position; updates scalar accumulators</w:t>
             </w:r>
           </w:p>
         </w:tc>
@@ -9257,7 +10021,14 @@
                 <w:color w:val="1C2422"/>
                 <w:shd w:val="clear" w:color="auto" w:fill="F3F4F6"/>
               </w:rPr>
-              <w:t xml:space="preserve">SeniorityLedger.changeDiet()</w:t>
+              <w:t xml:space="preserve">StakingVault.redeem()</w:t>
+            </w:r>
+            <w:r>
+              <w:rPr>
+                <w:sz w:val="19"/>
+                <w:color w:val="1F1F1F"/>
+              </w:rPr>
+              <w:t xml:space="preserve"> (Unstake)</w:t>
             </w:r>
           </w:p>
         </w:tc>
@@ -9314,21 +10085,21 @@
                 <w:sz w:val="19"/>
                 <w:color w:val="1F1F1F"/>
               </w:rPr>
-              <w:t xml:space="preserve">~68,400</w:t>
-            </w:r>
-          </w:p>
-        </w:tc>
-        <w:tc>
-          <w:p>
-            <w:pPr>
-              <w:spacing w:before="40" w:after="40"/>
-            </w:pPr>
-            <w:r>
-              <w:rPr>
-                <w:sz w:val="19"/>
-                <w:color w:val="1F1F1F"/>
-              </w:rPr>
-              <w:t xml:space="preserve">Updates next-interval DIET pointer and slot mapping; invariant to pool size</w:t>
+              <w:t xml:space="preserve">~125,600</w:t>
+            </w:r>
+          </w:p>
+        </w:tc>
+        <w:tc>
+          <w:p>
+            <w:pPr>
+              <w:spacing w:before="40" w:after="40"/>
+            </w:pPr>
+            <w:r>
+              <w:rPr>
+                <w:sz w:val="19"/>
+                <w:color w:val="1F1F1F"/>
+              </w:rPr>
+              <w:t xml:space="preserve">100% principal return; logs mid-interval exit and zeroes active seniority weight</w:t>
             </w:r>
           </w:p>
         </w:tc>
@@ -9346,7 +10117,185 @@
                 <w:color w:val="1C2422"/>
                 <w:shd w:val="clear" w:color="auto" w:fill="F3F4F6"/>
               </w:rPr>
-              <w:t xml:space="preserve">IntervalController.advanceInterval()</w:t>
+              <w:t xml:space="preserve">StakingVault.redeemAndIssueCertificate()</w:t>
+            </w:r>
+          </w:p>
+        </w:tc>
+        <w:tc>
+          <w:p>
+            <w:pPr>
+              <w:spacing w:before="40" w:after="40"/>
+            </w:pPr>
+            <w:r>
+              <w:rPr>
+                <w:sz w:val="19"/>
+                <w:color w:val="1F1F1F"/>
+              </w:rPr>
+              <w:t xml:space="preserve">User</w:t>
+            </w:r>
+          </w:p>
+        </w:tc>
+        <w:tc>
+          <w:p>
+            <w:pPr>
+              <w:spacing w:before="40" w:after="40"/>
+            </w:pPr>
+            <w:r>
+              <w:rPr>
+                <w:sz w:val="19"/>
+                <w:color w:val="1F1F1F"/>
+              </w:rPr>
+              <w:t xml:space="preserve"/>
+            </w:r>
+            <w:r>
+              <w:rPr>
+                <w:i/>
+                <w:sz w:val="19"/>
+                <w:color w:val="1C2422"/>
+              </w:rPr>
+              <w:t xml:space="preserve">O(1)</w:t>
+            </w:r>
+            <w:r>
+              <w:rPr>
+                <w:sz w:val="19"/>
+                <w:color w:val="1F1F1F"/>
+              </w:rPr>
+              <w:t xml:space="preserve"/>
+            </w:r>
+          </w:p>
+        </w:tc>
+        <w:tc>
+          <w:p>
+            <w:pPr>
+              <w:spacing w:before="40" w:after="40"/>
+            </w:pPr>
+            <w:r>
+              <w:rPr>
+                <w:sz w:val="19"/>
+                <w:color w:val="1F1F1F"/>
+              </w:rPr>
+              <w:t xml:space="preserve">~189,000</w:t>
+            </w:r>
+          </w:p>
+        </w:tc>
+        <w:tc>
+          <w:p>
+            <w:pPr>
+              <w:spacing w:before="40" w:after="40"/>
+            </w:pPr>
+            <w:r>
+              <w:rPr>
+                <w:sz w:val="19"/>
+                <w:color w:val="1F1F1F"/>
+              </w:rPr>
+              <w:t xml:space="preserve">Returns principal, transfers 100k FATCAT to DEAD address, mints on-chain ERC-721 credential</w:t>
+            </w:r>
+          </w:p>
+        </w:tc>
+      </w:tr>
+      <w:tr>
+        <w:tc>
+          <w:p>
+            <w:pPr>
+              <w:spacing w:before="40" w:after="40"/>
+            </w:pPr>
+            <w:r>
+              <w:rPr>
+                <w:rFonts w:ascii="Menlo" w:hAnsi="Menlo"/>
+                <w:sz w:val="17"/>
+                <w:color w:val="1C2422"/>
+                <w:shd w:val="clear" w:color="auto" w:fill="F3F4F6"/>
+              </w:rPr>
+              <w:t xml:space="preserve">StakingVault.setDiet()</w:t>
+            </w:r>
+          </w:p>
+        </w:tc>
+        <w:tc>
+          <w:p>
+            <w:pPr>
+              <w:spacing w:before="40" w:after="40"/>
+            </w:pPr>
+            <w:r>
+              <w:rPr>
+                <w:sz w:val="19"/>
+                <w:color w:val="1F1F1F"/>
+              </w:rPr>
+              <w:t xml:space="preserve">User</w:t>
+            </w:r>
+          </w:p>
+        </w:tc>
+        <w:tc>
+          <w:p>
+            <w:pPr>
+              <w:spacing w:before="40" w:after="40"/>
+            </w:pPr>
+            <w:r>
+              <w:rPr>
+                <w:sz w:val="19"/>
+                <w:color w:val="1F1F1F"/>
+              </w:rPr>
+              <w:t xml:space="preserve"/>
+            </w:r>
+            <w:r>
+              <w:rPr>
+                <w:i/>
+                <w:sz w:val="19"/>
+                <w:color w:val="1C2422"/>
+              </w:rPr>
+              <w:t xml:space="preserve">O(1)</w:t>
+            </w:r>
+            <w:r>
+              <w:rPr>
+                <w:sz w:val="19"/>
+                <w:color w:val="1F1F1F"/>
+              </w:rPr>
+              <w:t xml:space="preserve"/>
+            </w:r>
+          </w:p>
+        </w:tc>
+        <w:tc>
+          <w:p>
+            <w:pPr>
+              <w:spacing w:before="40" w:after="40"/>
+            </w:pPr>
+            <w:r>
+              <w:rPr>
+                <w:sz w:val="19"/>
+                <w:color w:val="1F1F1F"/>
+              </w:rPr>
+              <w:t xml:space="preserve">~68,400</w:t>
+            </w:r>
+          </w:p>
+        </w:tc>
+        <w:tc>
+          <w:p>
+            <w:pPr>
+              <w:spacing w:before="40" w:after="40"/>
+            </w:pPr>
+            <w:r>
+              <w:rPr>
+                <w:sz w:val="19"/>
+                <w:color w:val="1F1F1F"/>
+              </w:rPr>
+              <w:t xml:space="preserve">Updates next-interval DIET pointer and slot mapping; invariant to pool size</w:t>
+            </w:r>
+          </w:p>
+        </w:tc>
+      </w:tr>
+      <w:tr>
+        <w:tc>
+          <w:p>
+            <w:pPr>
+              <w:spacing w:before="40" w:after="40"/>
+            </w:pPr>
+            <w:r>
+              <w:rPr>
+                <w:rFonts w:ascii="Menlo" w:hAnsi="Menlo"/>
+                <w:sz w:val="17"/>
+                <w:color w:val="1C2422"/>
+                <w:shd w:val="clear" w:color="auto" w:fill="F3F4F6"/>
+              </w:rPr>
+              <w:t xml:space="preserve">IntervalController.advance()</w:t>
             </w:r>
           </w:p>
         </w:tc>
@@ -11275,7 +12224,7 @@
           <w:sz w:val="21"/>
           <w:color w:val="1F1F1F"/>
         </w:rPr>
-        <w:t xml:space="preserve">: Both parties adhere to responsible disclosure principles while patches are engineered, verified, and deployed through standard governance timelocks.</w:t>
+        <w:t xml:space="preserve">: Both parties adhere to responsible disclosure principles while patches are engineered, verified, and deployed through governance migration procedures.</w:t>
       </w:r>
     </w:p>
     <w:p>
@@ -11312,7 +12261,7 @@
           <w:sz w:val="22"/>
           <w:color w:val="1F1F1F"/>
         </w:rPr>
-        <w:t xml:space="preserve">While the protocol avoids rigid mechanical bounty tiers, verified Critical and High severity findings are eligible for significant discretionary decentralized grants disbursed from the community treasury, scaled to impact and technical rigor.</w:t>
+        <w:t xml:space="preserve">While the protocol avoids rigid mechanical bounty tiers, verified Critical and High severity findings are eligible for discretionary decentralized grants disbursed from the Ops Safe operational funds, scaled to impact and technical rigor. The protocol employs an immutable architecture; in the event that remediation requires contract replacements, governance will coordinate migration procedures and deploy verified successors.</w:t>
       </w:r>
     </w:p>
     <w:p>

</xml_diff>

<commit_message>
docs: add localized Chinese SVG diagrams and update Chinese doc links
</commit_message>
<xml_diff>
--- a/assets/whitepaper/TheFatCat_Whitepaper_v1.0_EN.docx
+++ b/assets/whitepaper/TheFatCat_Whitepaper_v1.0_EN.docx
@@ -4336,7 +4336,7 @@
           <w:sz w:val="21"/>
           <w:color w:val="1F1F1F"/>
         </w:rPr>
-        <w:t xml:space="preserve">: Deployed alongside the core staking contracts. When fully exiting an active standard position, as long as principal satisfies </w:t>
+        <w:t xml:space="preserve">: Deployed alongside the core staking contracts. Once the Governor multisig has opened issuance, stakers fully exiting an active standard position with principal </w:t>
       </w:r>
       <w:r>
         <w:rPr>
@@ -4351,7 +4351,7 @@
           <w:sz w:val="21"/>
           <w:color w:val="1F1F1F"/>
         </w:rPr>
-        <w:t xml:space="preserve"> and the contract has been deployed for at least 21 days (</w:t>
+        <w:t xml:space="preserve"> may call </w:t>
       </w:r>
       <w:r>
         <w:rPr>
@@ -4360,14 +4360,56 @@
           <w:color w:val="1C2422"/>
           <w:shd w:val="clear" w:color="auto" w:fill="F3F4F6"/>
         </w:rPr>
-        <w:t xml:space="preserve">mintOpensAt</w:t>
-      </w:r>
-      <w:r>
-        <w:rPr>
-          <w:sz w:val="21"/>
-          <w:color w:val="1F1F1F"/>
-        </w:rPr>
-        <w:t xml:space="preserve"> unlocked), stakers may call </w:t>
+        <w:t xml:space="preserve">redeemAndIssueCertificate()</w:t>
+      </w:r>
+      <w:r>
+        <w:rPr>
+          <w:sz w:val="21"/>
+          <w:color w:val="1F1F1F"/>
+        </w:rPr>
+        <w:t xml:space="preserve"> to imprint their accrued seniority notch (</w:t>
+      </w:r>
+      <w:r>
+        <w:rPr>
+          <w:i/>
+          <w:sz w:val="21"/>
+          <w:color w:val="1C2422"/>
+        </w:rPr>
+        <w:t xml:space="preserve">c_i \in [1, 22]</w:t>
+      </w:r>
+      <w:r>
+        <w:rPr>
+          <w:sz w:val="21"/>
+          <w:color w:val="1F1F1F"/>
+        </w:rPr>
+        <w:t xml:space="preserve">) into an immutable ERC-721 credential token (available across all notches, not restricted to notch 22);</w:t>
+      </w:r>
+    </w:p>
+    <w:p>
+      <w:pPr>
+        <w:pStyle w:val="ListBullet"/>
+      </w:pPr>
+      <w:r>
+        <w:rPr>
+          <w:color w:val="0F5C46"/>
+        </w:rPr>
+        <w:t xml:space="preserve">•  </w:t>
+      </w:r>
+      <w:r>
+        <w:rPr>
+          <w:b/>
+          <w:sz w:val="21"/>
+          <w:szCs w:val="21"/>
+          <w:color w:val="1F1F1F"/>
+        </w:rPr>
+        <w:t xml:space="preserve">Permanent Dead Address Lock</w:t>
+      </w:r>
+      <w:r>
+        <w:rPr>
+          <w:sz w:val="21"/>
+          <w:color w:val="1F1F1F"/>
+        </w:rPr>
+        <w:t xml:space="preserve">: Minting permanently transfers the fixed </w:t>
       </w:r>
       <w:r>
         <w:rPr>
@@ -4376,56 +4418,14 @@
           <w:color w:val="1C2422"/>
           <w:shd w:val="clear" w:color="auto" w:fill="F3F4F6"/>
         </w:rPr>
-        <w:t xml:space="preserve">redeemAndIssueCertificate()</w:t>
-      </w:r>
-      <w:r>
-        <w:rPr>
-          <w:sz w:val="21"/>
-          <w:color w:val="1F1F1F"/>
-        </w:rPr>
-        <w:t xml:space="preserve"> to imprint their accrued seniority notch (</w:t>
-      </w:r>
-      <w:r>
-        <w:rPr>
-          <w:i/>
-          <w:sz w:val="21"/>
-          <w:color w:val="1C2422"/>
-        </w:rPr>
-        <w:t xml:space="preserve">c_i \in [1, 22]</w:t>
-      </w:r>
-      <w:r>
-        <w:rPr>
-          <w:sz w:val="21"/>
-          <w:color w:val="1F1F1F"/>
-        </w:rPr>
-        <w:t xml:space="preserve">) into an immutable ERC-721 credential token (available across all notches, not restricted to notch 22);</w:t>
-      </w:r>
-    </w:p>
-    <w:p>
-      <w:pPr>
-        <w:pStyle w:val="ListBullet"/>
-      </w:pPr>
-      <w:r>
-        <w:rPr>
-          <w:color w:val="0F5C46"/>
-        </w:rPr>
-        <w:t xml:space="preserve">•  </w:t>
-      </w:r>
-      <w:r>
-        <w:rPr>
-          <w:b/>
-          <w:sz w:val="21"/>
-          <w:szCs w:val="21"/>
-          <w:color w:val="1F1F1F"/>
-        </w:rPr>
-        <w:t xml:space="preserve">Permanent Dead Address Lock</w:t>
-      </w:r>
-      <w:r>
-        <w:rPr>
-          <w:sz w:val="21"/>
-          <w:color w:val="1F1F1F"/>
-        </w:rPr>
-        <w:t xml:space="preserve">: Minting permanently transfers the fixed </w:t>
+        <w:t xml:space="preserve">100_000 FATCAT</w:t>
+      </w:r>
+      <w:r>
+        <w:rPr>
+          <w:sz w:val="21"/>
+          <w:color w:val="1F1F1F"/>
+        </w:rPr>
+        <w:t xml:space="preserve"> (</w:t>
       </w:r>
       <w:r>
         <w:rPr>
@@ -4434,14 +4434,14 @@
           <w:color w:val="1C2422"/>
           <w:shd w:val="clear" w:color="auto" w:fill="F3F4F6"/>
         </w:rPr>
-        <w:t xml:space="preserve">100_000 FATCAT</w:t>
-      </w:r>
-      <w:r>
-        <w:rPr>
-          <w:sz w:val="21"/>
-          <w:color w:val="1F1F1F"/>
-        </w:rPr>
-        <w:t xml:space="preserve"> (</w:t>
+        <w:t xml:space="preserve">MINT_BURN</w:t>
+      </w:r>
+      <w:r>
+        <w:rPr>
+          <w:sz w:val="21"/>
+          <w:color w:val="1F1F1F"/>
+        </w:rPr>
+        <w:t xml:space="preserve">) directly to the blackhole dead address </w:t>
       </w:r>
       <w:r>
         <w:rPr>
@@ -4450,14 +4450,14 @@
           <w:color w:val="1C2422"/>
           <w:shd w:val="clear" w:color="auto" w:fill="F3F4F6"/>
         </w:rPr>
-        <w:t xml:space="preserve">MINT_BURN</w:t>
-      </w:r>
-      <w:r>
-        <w:rPr>
-          <w:sz w:val="21"/>
-          <w:color w:val="1F1F1F"/>
-        </w:rPr>
-        <w:t xml:space="preserve">) directly to the blackhole dead address </w:t>
+        <w:t xml:space="preserve">0x000000000000000000000000000000000000dEaD</w:t>
+      </w:r>
+      <w:r>
+        <w:rPr>
+          <w:sz w:val="21"/>
+          <w:color w:val="1F1F1F"/>
+        </w:rPr>
+        <w:t xml:space="preserve">, achieving factual permanent removal from circulation (underlying token </w:t>
       </w:r>
       <w:r>
         <w:rPr>
@@ -4466,14 +4466,14 @@
           <w:color w:val="1C2422"/>
           <w:shd w:val="clear" w:color="auto" w:fill="F3F4F6"/>
         </w:rPr>
-        <w:t xml:space="preserve">0x000000000000000000000000000000000000dEaD</w:t>
-      </w:r>
-      <w:r>
-        <w:rPr>
-          <w:sz w:val="21"/>
-          <w:color w:val="1F1F1F"/>
-        </w:rPr>
-        <w:t xml:space="preserve">, achieving factual permanent removal from circulation (underlying token </w:t>
+        <w:t xml:space="preserve">transfer(DEAD, MINT_BURN)</w:t>
+      </w:r>
+      <w:r>
+        <w:rPr>
+          <w:sz w:val="21"/>
+          <w:color w:val="1F1F1F"/>
+        </w:rPr>
+        <w:t xml:space="preserve">, not a </w:t>
       </w:r>
       <w:r>
         <w:rPr>
@@ -4482,14 +4482,14 @@
           <w:color w:val="1C2422"/>
           <w:shd w:val="clear" w:color="auto" w:fill="F3F4F6"/>
         </w:rPr>
-        <w:t xml:space="preserve">transfer(DEAD, MINT_BURN)</w:t>
-      </w:r>
-      <w:r>
-        <w:rPr>
-          <w:sz w:val="21"/>
-          <w:color w:val="1F1F1F"/>
-        </w:rPr>
-        <w:t xml:space="preserve">, not a </w:t>
+        <w:t xml:space="preserve">burn()</w:t>
+      </w:r>
+      <w:r>
+        <w:rPr>
+          <w:sz w:val="21"/>
+          <w:color w:val="1F1F1F"/>
+        </w:rPr>
+        <w:t xml:space="preserve"> call that reduces </w:t>
       </w:r>
       <w:r>
         <w:rPr>
@@ -4498,14 +4498,41 @@
           <w:color w:val="1C2422"/>
           <w:shd w:val="clear" w:color="auto" w:fill="F3F4F6"/>
         </w:rPr>
-        <w:t xml:space="preserve">burn()</w:t>
-      </w:r>
-      <w:r>
-        <w:rPr>
-          <w:sz w:val="21"/>
-          <w:color w:val="1F1F1F"/>
-        </w:rPr>
-        <w:t xml:space="preserve"> call that reduces </w:t>
+        <w:t xml:space="preserve">totalSupply</w:t>
+      </w:r>
+      <w:r>
+        <w:rPr>
+          <w:sz w:val="21"/>
+          <w:color w:val="1F1F1F"/>
+        </w:rPr>
+        <w:t xml:space="preserve">); remaining principal is refunded to the user;</w:t>
+      </w:r>
+    </w:p>
+    <w:p>
+      <w:pPr>
+        <w:pStyle w:val="ListBullet"/>
+      </w:pPr>
+      <w:r>
+        <w:rPr>
+          <w:color w:val="0F5C46"/>
+        </w:rPr>
+        <w:t xml:space="preserve">•  </w:t>
+      </w:r>
+      <w:r>
+        <w:rPr>
+          <w:b/>
+          <w:sz w:val="21"/>
+          <w:szCs w:val="21"/>
+          <w:color w:val="1F1F1F"/>
+        </w:rPr>
+        <w:t xml:space="preserve">Certificate Staking &amp; Threshold Exemption</w:t>
+      </w:r>
+      <w:r>
+        <w:rPr>
+          <w:sz w:val="21"/>
+          <w:color w:val="1F1F1F"/>
+        </w:rPr>
+        <w:t xml:space="preserve">: Holders of an unallocated certificate can call </w:t>
       </w:r>
       <w:r>
         <w:rPr>
@@ -4514,41 +4541,29 @@
           <w:color w:val="1C2422"/>
           <w:shd w:val="clear" w:color="auto" w:fill="F3F4F6"/>
         </w:rPr>
-        <w:t xml:space="preserve">totalSupply</w:t>
-      </w:r>
-      <w:r>
-        <w:rPr>
-          <w:sz w:val="21"/>
-          <w:color w:val="1F1F1F"/>
-        </w:rPr>
-        <w:t xml:space="preserve">); remaining principal is refunded to the user;</w:t>
-      </w:r>
-    </w:p>
-    <w:p>
-      <w:pPr>
-        <w:pStyle w:val="ListBullet"/>
-      </w:pPr>
-      <w:r>
-        <w:rPr>
-          <w:color w:val="0F5C46"/>
-        </w:rPr>
-        <w:t xml:space="preserve">•  </w:t>
-      </w:r>
-      <w:r>
-        <w:rPr>
-          <w:b/>
-          <w:sz w:val="21"/>
-          <w:szCs w:val="21"/>
-          <w:color w:val="1F1F1F"/>
-        </w:rPr>
-        <w:t xml:space="preserve">Certificate Staking &amp; Threshold Exemption</w:t>
-      </w:r>
-      <w:r>
-        <w:rPr>
-          <w:sz w:val="21"/>
-          <w:color w:val="1F1F1F"/>
-        </w:rPr>
-        <w:t xml:space="preserve">: Holders of an unallocated certificate can call </w:t>
+        <w:t xml:space="preserve">stakeWithCertificate(principal, diet, certificateId)</w:t>
+      </w:r>
+      <w:r>
+        <w:rPr>
+          <w:sz w:val="21"/>
+          <w:color w:val="1F1F1F"/>
+        </w:rPr>
+        <w:t xml:space="preserve"> to open a position, inheriting the certificate's starting multiplier (head-start </w:t>
+      </w:r>
+      <w:r>
+        <w:rPr>
+          <w:i/>
+          <w:sz w:val="21"/>
+          <w:color w:val="1C2422"/>
+        </w:rPr>
+        <w:t xml:space="preserve">\text{head} = \text{multiplier} - 1</w:t>
+      </w:r>
+      <w:r>
+        <w:rPr>
+          <w:sz w:val="21"/>
+          <w:color w:val="1F1F1F"/>
+        </w:rPr>
+        <w:t xml:space="preserve">) and exempt from the </w:t>
       </w:r>
       <w:r>
         <w:rPr>
@@ -4557,29 +4572,14 @@
           <w:color w:val="1C2422"/>
           <w:shd w:val="clear" w:color="auto" w:fill="F3F4F6"/>
         </w:rPr>
-        <w:t xml:space="preserve">stakeWithCertificate(principal, diet, certificateId)</w:t>
-      </w:r>
-      <w:r>
-        <w:rPr>
-          <w:sz w:val="21"/>
-          <w:color w:val="1F1F1F"/>
-        </w:rPr>
-        <w:t xml:space="preserve"> to open a position, inheriting the certificate's starting multiplier (head-start </w:t>
-      </w:r>
-      <w:r>
-        <w:rPr>
-          <w:i/>
-          <w:sz w:val="21"/>
-          <w:color w:val="1C2422"/>
-        </w:rPr>
-        <w:t xml:space="preserve">\text{head} = \text{multiplier} - 1</w:t>
-      </w:r>
-      <w:r>
-        <w:rPr>
-          <w:sz w:val="21"/>
-          <w:color w:val="1F1F1F"/>
-        </w:rPr>
-        <w:t xml:space="preserve">) and exempt from the </w:t>
+        <w:t xml:space="preserve">minStake</w:t>
+      </w:r>
+      <w:r>
+        <w:rPr>
+          <w:sz w:val="21"/>
+          <w:color w:val="1F1F1F"/>
+        </w:rPr>
+        <w:t xml:space="preserve"> requirement. The certificate is exclusively locked (</w:t>
       </w:r>
       <w:r>
         <w:rPr>
@@ -4588,22 +4588,6 @@
           <w:color w:val="1C2422"/>
           <w:shd w:val="clear" w:color="auto" w:fill="F3F4F6"/>
         </w:rPr>
-        <w:t xml:space="preserve">minStake</w:t>
-      </w:r>
-      <w:r>
-        <w:rPr>
-          <w:sz w:val="21"/>
-          <w:color w:val="1F1F1F"/>
-        </w:rPr>
-        <w:t xml:space="preserve"> requirement. The certificate is exclusively locked (</w:t>
-      </w:r>
-      <w:r>
-        <w:rPr>
-          <w:rFonts w:ascii="Menlo" w:hAnsi="Menlo"/>
-          <w:sz w:val="19"/>
-          <w:color w:val="1C2422"/>
-          <w:shd w:val="clear" w:color="auto" w:fill="F3F4F6"/>
-        </w:rPr>
         <w:t xml:space="preserve">inUse == true</w:t>
       </w:r>
       <w:r>
@@ -4631,30 +4615,14 @@
           <w:szCs w:val="21"/>
           <w:color w:val="1F1F1F"/>
         </w:rPr>
-        <w:t xml:space="preserve">Fixed Hard Cap &amp; Cold-Start Lock</w:t>
-      </w:r>
-      <w:r>
-        <w:rPr>
-          <w:sz w:val="21"/>
-          <w:color w:val="1F1F1F"/>
-        </w:rPr>
-        <w:t xml:space="preserve">: Capped at 10,000 tokens; minting opens once 21 days after deployment (</w:t>
-      </w:r>
-      <w:r>
-        <w:rPr>
-          <w:rFonts w:ascii="Menlo" w:hAnsi="Menlo"/>
-          <w:sz w:val="19"/>
-          <w:color w:val="1C2422"/>
-          <w:shd w:val="clear" w:color="auto" w:fill="F3F4F6"/>
-        </w:rPr>
-        <w:t xml:space="preserve">deploy + MINT_DELAY</w:t>
-      </w:r>
-      <w:r>
-        <w:rPr>
-          <w:sz w:val="21"/>
-          <w:color w:val="1F1F1F"/>
-        </w:rPr>
-        <w:t xml:space="preserve">); no per-mint cooldown;</w:t>
+        <w:t xml:space="preserve">Fixed Hard Cap &amp; One-Time Opening</w:t>
+      </w:r>
+      <w:r>
+        <w:rPr>
+          <w:sz w:val="21"/>
+          <w:color w:val="1F1F1F"/>
+        </w:rPr>
+        <w:t xml:space="preserve">: Capped at 9,999 tokens; issuance deploys closed and can be opened once by the Governor multisig, after which it cannot be closed. There is no automatic unlock or on-chain minimum waiting period;</w:t>
       </w:r>
     </w:p>
     <w:p>
@@ -6212,7 +6180,7 @@
           <w:sz w:val="22"/>
           <w:color w:val="1F1F1F"/>
         </w:rPr>
-        <w:t xml:space="preserve">The repository records multiple adversarial and operational review rounds. Test totals are revision- and endpoint-dependent and must be published with a commit, command and evidence artifact rather than as timeless protocol constants. As of this draft's current working tree, </w:t>
+        <w:t xml:space="preserve">The repository records multiple adversarial and operational review rounds. Test totals are revision- and endpoint-dependent and must be published with a commit, command and evidence artifact rather than as timeless protocol constants. The local non-fork suite (</w:t>
       </w:r>
       <w:r>
         <w:rPr>
@@ -6228,23 +6196,7 @@
           <w:sz w:val="22"/>
           <w:color w:val="1F1F1F"/>
         </w:rPr>
-        <w:t xml:space="preserve"> reports </w:t>
-      </w:r>
-      <w:r>
-        <w:rPr>
-          <w:b/>
-          <w:sz w:val="22"/>
-          <w:szCs w:val="22"/>
-          <w:color w:val="1F1F1F"/>
-        </w:rPr>
-        <w:t xml:space="preserve">78+ suites / 582 tests / 0 failures</w:t>
-      </w:r>
-      <w:r>
-        <w:rPr>
-          <w:sz w:val="22"/>
-          <w:color w:val="1F1F1F"/>
-        </w:rPr>
-        <w:t xml:space="preserve">. Mainnet-fork results are evidence only for the pinned block and RPC used by that run.</w:t>
+        <w:t xml:space="preserve">) passes; mainnet-fork results are evidence only for the pinned block and RPC used by that run.</w:t>
       </w:r>
     </w:p>
     <w:p>
@@ -11715,7 +11667,7 @@
                 <w:sz w:val="19"/>
                 <w:color w:val="1F1F1F"/>
               </w:rPr>
-              <w:t xml:space="preserve">Genesis exit credential; burn 100k FATCAT to mint, 10k cap, 21d delay, 100% on-chain SVG</w:t>
+              <w:t xml:space="preserve">Genesis exit credential; transfer 100k FATCAT to the dead address to mint, 9,999-token cap, one-time Governor multisig opening, 100% on-chain SVG</w:t>
             </w:r>
           </w:p>
         </w:tc>

</xml_diff>